<commit_message>
fix(phong-vattu): re-convert .doc files with LibreOffice to restore table structure
- Installed LibreOffice (soffice v26.2.5) via Homebrew
- Re-converted 6 .doc files with soffice --headless --convert-to docx
- All 11 .docx files now have real <w:tbl> structures
- Tables accessible via officecli get/set on /body/tbl[N]/tr[R]/tc[C]
- Updated README.md to reflect the fix

Co-authored-by: Orca <help@stably.ai>
</commit_message>
<xml_diff>
--- a/skills/phong-vattu/assets/qd-phe-duyet-nhiem-vu-du-toan.docx
+++ b/skills/phong-vattu/assets/qd-phe-duyet-nhiem-vu-du-toan.docx
@@ -1,87 +1,6 @@
 
-<file path=./[Content_Types].xml><?xml version="1.0" encoding="utf-8"?>
-<Types xmlns="http://schemas.openxmlformats.org/package/2006/content-types">
-  <Default Extension="rels" ContentType="application/vnd.openxmlformats-package.relationships+xml"/>
-  <Default Extension="xml" ContentType="application/xml"/>
-  <Override PartName="/word/document.xml" ContentType="application/vnd.openxmlformats-officedocument.wordprocessingml.document.main+xml"/>
-  <Override PartName="/customXml/itemProps1.xml" ContentType="application/vnd.openxmlformats-officedocument.customXmlProperties+xml"/>
-  <Override PartName="/word/numbering.xml" ContentType="application/vnd.openxmlformats-officedocument.wordprocessingml.numbering+xml"/>
-  <Override PartName="/word/styles.xml" ContentType="application/vnd.openxmlformats-officedocument.wordprocessingml.styles+xml"/>
-  <Override PartName="/word/settings.xml" ContentType="application/vnd.openxmlformats-officedocument.wordprocessingml.settings+xml"/>
-  <Override PartName="/word/webSettings.xml" ContentType="application/vnd.openxmlformats-officedocument.wordprocessingml.webSettings+xml"/>
-  <Override PartName="/word/footnotes.xml" ContentType="application/vnd.openxmlformats-officedocument.wordprocessingml.footnotes+xml"/>
-  <Override PartName="/word/endnotes.xml" ContentType="application/vnd.openxmlformats-officedocument.wordprocessingml.endnotes+xml"/>
-  <Override PartName="/word/header1.xml" ContentType="application/vnd.openxmlformats-officedocument.wordprocessingml.header+xml"/>
-  <Override PartName="/word/footer1.xml" ContentType="application/vnd.openxmlformats-officedocument.wordprocessingml.footer+xml"/>
-  <Override PartName="/word/fontTable.xml" ContentType="application/vnd.openxmlformats-officedocument.wordprocessingml.fontTable+xml"/>
-  <Override PartName="/word/theme/theme1.xml" ContentType="application/vnd.openxmlformats-officedocument.theme+xml"/>
-  <Override PartName="/docProps/core.xml" ContentType="application/vnd.openxmlformats-package.core-properties+xml"/>
-  <Override PartName="/docProps/app.xml" ContentType="application/vnd.openxmlformats-officedocument.extended-properties+xml"/>
-</Types>
-</file>
-
-<file path=./customXml/item1.xml><?xml version="1.0" encoding="utf-8"?>
-<b:Sources xmlns:b="http://schemas.openxmlformats.org/officeDocument/2006/bibliography" xmlns="http://schemas.openxmlformats.org/officeDocument/2006/bibliography" SelectedStyle="\APASixthEditionOfficeOnline.xsl" StyleName="APA" Version="6"/>
-</file>
-
-<file path=./customXml/itemProps1.xml><?xml version="1.0" encoding="utf-8"?>
-<ds:datastoreItem xmlns:ds="http://schemas.openxmlformats.org/officeDocument/2006/customXml" ds:itemID="{09C45EF4-329A-45EF-B587-9D7B79716C8A}">
-  <ds:schemaRefs>
-    <ds:schemaRef ds:uri="http://schemas.openxmlformats.org/officeDocument/2006/bibliography"/>
-  </ds:schemaRefs>
-</ds:datastoreItem>
-</file>
-
-<file path=./docProps/app.xml><?xml version="1.0" encoding="utf-8"?>
-<Properties xmlns="http://schemas.openxmlformats.org/officeDocument/2006/extended-properties" xmlns:vt="http://schemas.openxmlformats.org/officeDocument/2006/docPropsVTypes">
-  <Template>Normal</Template>
-  <TotalTime>595</TotalTime>
-  <Pages>1</Pages>
-  <Words>1293</Words>
-  <Characters>7371</Characters>
-  <Application>Microsoft Office Word</Application>
-  <DocSecurity>0</DocSecurity>
-  <Lines>61</Lines>
-  <Paragraphs>17</Paragraphs>
-  <ScaleCrop>false</ScaleCrop>
-  <HeadingPairs>
-    <vt:vector size="2" baseType="variant">
-      <vt:variant>
-        <vt:lpstr>Title</vt:lpstr>
-      </vt:variant>
-      <vt:variant>
-        <vt:i4>1</vt:i4>
-      </vt:variant>
-    </vt:vector>
-  </HeadingPairs>
-  <TitlesOfParts>
-    <vt:vector size="1" baseType="lpstr">
-      <vt:lpstr>QD nguon von</vt:lpstr>
-    </vt:vector>
-  </TitlesOfParts>
-  <Company>Grizli777</Company>
-  <LinksUpToDate>false</LinksUpToDate>
-  <CharactersWithSpaces>8647</CharactersWithSpaces>
-  <SharedDoc>false</SharedDoc>
-  <HyperlinksChanged>false</HyperlinksChanged>
-  <AppVersion>16.0000</AppVersion>
-</Properties>
-</file>
-
-<file path=./docProps/core.xml><?xml version="1.0" encoding="utf-8"?>
-<cp:coreProperties xmlns:cp="http://schemas.openxmlformats.org/package/2006/metadata/core-properties" xmlns:dc="http://purl.org/dc/elements/1.1/" xmlns:dcterms="http://purl.org/dc/terms/" xmlns:dcmitype="http://purl.org/dc/dcmitype/" xmlns:xsi="http://www.w3.org/2001/XMLSchema-instance">
-  <dc:title>QD nguon von</dc:title>
-  <dc:creator>Customer</dc:creator>
-  <cp:lastModifiedBy>MY</cp:lastModifiedBy>
-  <cp:revision>92</cp:revision>
-  <cp:lastPrinted>2025-05-08T12:42:00Z</cp:lastPrinted>
-  <dcterms:created xsi:type="dcterms:W3CDTF">2025-05-30T10:26:00Z</dcterms:created>
-  <dcterms:modified xsi:type="dcterms:W3CDTF">2026-05-05T12:02:00Z</dcterms:modified>
-</cp:coreProperties>
-</file>
-
-<file path=./word/document.xml><?xml version="1.0" encoding="utf-8"?>
-<w:document xmlns:ns1="http://schemas.openxmlformats.org/markup-compatibility/2006" xmlns:ns10="http://schemas.openxmlformats.org/officeDocument/2006/relationships" xmlns:ns2="http://schemas.microsoft.com/office/word/2010/wordml" xmlns:ns3="http://schemas.openxmlformats.org/drawingml/2006/wordprocessingDrawing" xmlns:ns4="http://schemas.microsoft.com/office/word/2010/wordprocessingDrawing" xmlns:ns5="http://schemas.openxmlformats.org/drawingml/2006/main" xmlns:ns6="http://schemas.microsoft.com/office/word/2010/wordprocessingShape" xmlns:ns7="http://schemas.microsoft.com/office/drawing/2010/main" xmlns:ns8="urn:schemas-microsoft-com:vml" xmlns:ns9="urn:schemas-microsoft-com:office:office" xmlns:w="http://schemas.openxmlformats.org/wordprocessingml/2006/main" xmlns:wps="http://schemas.microsoft.com/office/word/2010/wordprocessingShape">
+<file path=word/document.xml><?xml version="1.0" encoding="utf-8"?>
+<w:document xmlns:wpc="http://schemas.microsoft.com/office/word/2010/wordprocessingCanvas" xmlns:cx="http://schemas.microsoft.com/office/drawing/2014/chartex" xmlns:mc="http://schemas.openxmlformats.org/markup-compatibility/2006" xmlns:o="urn:schemas-microsoft-com:office:office" xmlns:r="http://schemas.openxmlformats.org/officeDocument/2006/relationships" xmlns:m="http://schemas.openxmlformats.org/officeDocument/2006/math" xmlns:v="urn:schemas-microsoft-com:vml" xmlns:wp14="http://schemas.microsoft.com/office/word/2010/wordprocessingDrawing" xmlns:wp="http://schemas.openxmlformats.org/drawingml/2006/wordprocessingDrawing" xmlns:w10="urn:schemas-microsoft-com:office:word" xmlns:w="http://schemas.openxmlformats.org/wordprocessingml/2006/main" xmlns:w14="http://schemas.microsoft.com/office/word/2010/wordml" xmlns:w15="http://schemas.microsoft.com/office/word/2012/wordml" xmlns:w16se="http://schemas.microsoft.com/office/word/2015/wordml/symex" xmlns:wpg="http://schemas.microsoft.com/office/word/2010/wordprocessingGroup" xmlns:wpi="http://schemas.microsoft.com/office/word/2010/wordprocessingInk" xmlns:wne="http://schemas.microsoft.com/office/word/2006/wordml" xmlns:wps="http://schemas.microsoft.com/office/word/2010/wordprocessingShape">
   <w:body>
     <w:tbl>
       <w:tblPr>
@@ -102,7 +21,7 @@
         <w:gridCol w:w="3828"/>
         <w:gridCol w:w="6195"/>
       </w:tblGrid>
-      <w:tr ns2:paraId="57D4CE52" ns2:textId="77777777">
+      <w:tr>
         <w:trPr>
           <w:trHeight w:val="1124"/>
         </w:trPr>
@@ -110,7 +29,7 @@
           <w:tcPr>
             <w:tcW w:w="3828" w:type="dxa"/>
           </w:tcPr>
-          <w:p ns2:paraId="0E00B210" ns2:textId="77777777">
+          <w:p>
             <w:pPr>
               <w:spacing w:line="276" w:lineRule="auto"/>
               <w:jc w:val="center"/>
@@ -154,7 +73,7 @@
               <w:t>PHÚ THỌ</w:t>
             </w:r>
           </w:p>
-          <w:p ns2:paraId="4BBBBB58" ns2:textId="1ACE557E">
+          <w:p>
             <w:pPr>
               <w:spacing w:line="276" w:lineRule="auto"/>
               <w:jc w:val="center"/>
@@ -177,7 +96,7 @@
               <w:t xml:space="preserve">BỆNH VIỆN ĐA KHOA TỈNH </w:t>
             </w:r>
           </w:p>
-          <w:p ns2:paraId="7C0F0D43" ns2:textId="78B279C5">
+          <w:p>
             <w:pPr>
               <w:spacing w:before="120" w:line="276" w:lineRule="auto"/>
               <w:jc w:val="center"/>
@@ -198,74 +117,74 @@
                 <w:szCs w:val="28"/>
                 <w:lang w:val="en-US" w:eastAsia="en-US"/>
               </w:rPr>
-              <ns1:AlternateContent>
-                <ns1:Choice Requires="wps">
+              <mc:AlternateContent>
+                <mc:Choice Requires="wps">
                   <w:drawing>
-                    <ns3:anchor distT="0" distB="0" distL="114300" distR="114300" simplePos="0" relativeHeight="251656192" behindDoc="0" locked="0" layoutInCell="1" allowOverlap="1" ns4:editId="13EE1610">
-                      <ns3:simplePos x="0" y="0"/>
-                      <ns3:positionH relativeFrom="column">
-                        <ns3:posOffset>469900</ns3:posOffset>
-                      </ns3:positionH>
-                      <ns3:positionV relativeFrom="paragraph">
-                        <ns3:posOffset>19050</ns3:posOffset>
-                      </ns3:positionV>
-                      <ns3:extent cx="1356995" cy="0"/>
-                      <ns3:effectExtent l="0" t="0" r="33655" b="19050"/>
-                      <ns3:wrapNone/>
-                      <ns3:docPr id="2" name="Line 5"/>
-                      <ns3:cNvGraphicFramePr>
-                        <ns5:graphicFrameLocks/>
-                      </ns3:cNvGraphicFramePr>
-                      <ns5:graphic>
-                        <ns5:graphicData uri="http://schemas.microsoft.com/office/word/2010/wordprocessingShape">
-                          <ns6:wsp>
-                            <ns6:cNvCnPr>
-                              <ns5:cxnSpLocks noChangeShapeType="1"/>
-                            </ns6:cNvCnPr>
-                            <ns6:spPr bwMode="auto">
-                              <ns5:xfrm>
-                                <ns5:off x="0" y="0"/>
-                                <ns5:ext cx="1356995" cy="0"/>
-                              </ns5:xfrm>
-                              <ns5:prstGeom prst="line">
-                                <ns5:avLst/>
-                              </ns5:prstGeom>
-                              <ns5:noFill/>
-                              <ns5:ln w="9525">
-                                <ns5:solidFill>
-                                  <ns5:srgbClr val="000000"/>
-                                </ns5:solidFill>
-                                <ns5:round/>
-                                <ns5:headEnd/>
-                                <ns5:tailEnd/>
-                              </ns5:ln>
-                              <ns5:extLst>
-                                <ns5:ext uri="{909E8E84-426E-40DD-AFC4-6F175D3DCCD1}">
-                                  <ns7:hiddenFill>
-                                    <ns5:noFill/>
-                                  </ns7:hiddenFill>
-                                </ns5:ext>
-                              </ns5:extLst>
-                            </ns6:spPr>
-                            <ns6:bodyPr/>
-                          </ns6:wsp>
-                        </ns5:graphicData>
-                      </ns5:graphic>
-                      <ns4:sizeRelH relativeFrom="page">
-                        <ns4:pctWidth>0</ns4:pctWidth>
-                      </ns4:sizeRelH>
-                      <ns4:sizeRelV relativeFrom="page">
-                        <ns4:pctHeight>0</ns4:pctHeight>
-                      </ns4:sizeRelV>
-                    </ns3:anchor>
+                    <wp:anchor distT="0" distB="0" distL="114300" distR="114300" simplePos="0" relativeHeight="251656192" behindDoc="0" locked="0" layoutInCell="1" allowOverlap="1" wp14:editId="13EE1610">
+                      <wp:simplePos x="0" y="0"/>
+                      <wp:positionH relativeFrom="column">
+                        <wp:posOffset>469900</wp:posOffset>
+                      </wp:positionH>
+                      <wp:positionV relativeFrom="paragraph">
+                        <wp:posOffset>19050</wp:posOffset>
+                      </wp:positionV>
+                      <wp:extent cx="1356995" cy="0"/>
+                      <wp:effectExtent l="0" t="0" r="33655" b="19050"/>
+                      <wp:wrapNone/>
+                      <wp:docPr id="2" name="Line 5"/>
+                      <wp:cNvGraphicFramePr>
+                        <a:graphicFrameLocks xmlns:a="http://schemas.openxmlformats.org/drawingml/2006/main"/>
+                      </wp:cNvGraphicFramePr>
+                      <a:graphic xmlns:a="http://schemas.openxmlformats.org/drawingml/2006/main">
+                        <a:graphicData uri="http://schemas.microsoft.com/office/word/2010/wordprocessingShape">
+                          <wps:wsp>
+                            <wps:cNvCnPr>
+                              <a:cxnSpLocks noChangeShapeType="1"/>
+                            </wps:cNvCnPr>
+                            <wps:spPr bwMode="auto">
+                              <a:xfrm>
+                                <a:off x="0" y="0"/>
+                                <a:ext cx="1356995" cy="0"/>
+                              </a:xfrm>
+                              <a:prstGeom prst="line">
+                                <a:avLst/>
+                              </a:prstGeom>
+                              <a:noFill/>
+                              <a:ln w="9525">
+                                <a:solidFill>
+                                  <a:srgbClr val="000000"/>
+                                </a:solidFill>
+                                <a:round/>
+                                <a:headEnd/>
+                                <a:tailEnd/>
+                              </a:ln>
+                              <a:extLst>
+                                <a:ext uri="{909E8E84-426E-40DD-AFC4-6F175D3DCCD1}">
+                                  <a14:hiddenFill xmlns:a14="http://schemas.microsoft.com/office/drawing/2010/main">
+                                    <a:noFill/>
+                                  </a14:hiddenFill>
+                                </a:ext>
+                              </a:extLst>
+                            </wps:spPr>
+                            <wps:bodyPr/>
+                          </wps:wsp>
+                        </a:graphicData>
+                      </a:graphic>
+                      <wp14:sizeRelH relativeFrom="page">
+                        <wp14:pctWidth>0</wp14:pctWidth>
+                      </wp14:sizeRelH>
+                      <wp14:sizeRelV relativeFrom="page">
+                        <wp14:pctHeight>0</wp14:pctHeight>
+                      </wp14:sizeRelV>
+                    </wp:anchor>
                   </w:drawing>
-                </ns1:Choice>
-                <ns1:Fallback>
+                </mc:Choice>
+                <mc:Fallback>
                   <w:pict>
-                    <ns8:line id="Line 5" ns9:spid="_x0000_s1026" style="position:absolute;z-index:251656192;visibility:visible;mso-wrap-style:square;mso-width-percent:0;mso-height-percent:0;mso-wrap-distance-left:9pt;mso-wrap-distance-top:0;mso-wrap-distance-right:9pt;mso-wrap-distance-bottom:0;mso-position-horizontal:absolute;mso-position-horizontal-relative:text;mso-position-vertical:absolute;mso-position-vertical-relative:text;mso-width-percent:0;mso-height-percent:0;mso-width-relative:page;mso-height-relative:page" from="37pt,1.5pt" to="143.85pt,1.5pt" ns9:gfxdata="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"/>
+                    <v:line id="Line 5" o:spid="_x0000_s1026" style="position:absolute;z-index:251656192;visibility:visible;mso-wrap-style:square;mso-width-percent:0;mso-height-percent:0;mso-wrap-distance-left:9pt;mso-wrap-distance-top:0;mso-wrap-distance-right:9pt;mso-wrap-distance-bottom:0;mso-position-horizontal:absolute;mso-position-horizontal-relative:text;mso-position-vertical:absolute;mso-position-vertical-relative:text;mso-width-percent:0;mso-height-percent:0;mso-width-relative:page;mso-height-relative:page" from="37pt,1.5pt" to="143.85pt,1.5pt" o:gfxdata="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"/>
                   </w:pict>
-                </ns1:Fallback>
-              </ns1:AlternateContent>
+                </mc:Fallback>
+              </mc:AlternateContent>
             </w:r>
             <w:r>
               <w:rPr>
@@ -330,7 +249,7 @@
           <w:tcPr>
             <w:tcW w:w="6195" w:type="dxa"/>
           </w:tcPr>
-          <w:p ns2:paraId="687CAB90" ns2:textId="77777777">
+          <w:p>
             <w:pPr>
               <w:spacing w:line="276" w:lineRule="auto"/>
               <w:jc w:val="center"/>
@@ -351,7 +270,7 @@
               <w:t>CỘNG HÒA XÃ HỘI CHỦ NGHĨA VIỆT NAM</w:t>
             </w:r>
           </w:p>
-          <w:p ns2:paraId="11CEA6A1" ns2:textId="3BD64FB2">
+          <w:p>
             <w:pPr>
               <w:spacing w:line="276" w:lineRule="auto"/>
               <w:jc w:val="center"/>
@@ -410,7 +329,7 @@
               <w:t xml:space="preserve"> Hạnh phúc</w:t>
             </w:r>
           </w:p>
-          <w:p ns2:paraId="3FDB36DF" ns2:textId="09D8C2BE">
+          <w:p>
             <w:pPr>
               <w:spacing w:before="120" w:line="276" w:lineRule="auto"/>
               <w:jc w:val="center"/>
@@ -430,63 +349,62 @@
                 <w:szCs w:val="28"/>
                 <w:lang w:val="en-US" w:eastAsia="en-US"/>
               </w:rPr>
-              <ns1:AlternateContent>
-                <ns1:Choice Requires="wps">
+              <mc:AlternateContent>
+                <mc:Choice Requires="wps">
                   <w:drawing>
-                    <ns3:anchor distT="0" distB="0" distL="114300" distR="114300" simplePos="0" relativeHeight="251658240" behindDoc="0" locked="0" layoutInCell="1" allowOverlap="1" ns4:editId="7D0A8644">
-                      <ns3:simplePos x="0" y="0"/>
-                      <ns3:positionH relativeFrom="column">
-                        <ns3:posOffset>755650</ns3:posOffset>
-                      </ns3:positionH>
-                      <ns3:positionV relativeFrom="paragraph">
-                        <ns3:posOffset>20955</ns3:posOffset>
-                      </ns3:positionV>
-                      <ns3:extent cx="2181860" cy="0"/>
-                      <ns3:effectExtent l="0" t="0" r="27940" b="19050"/>
-                      <ns3:wrapNone/>
-                      <ns3:docPr id="4" name="Straight Connector 4"/>
-                      <ns3:cNvGraphicFramePr/>
-                      <ns5:graphic>
-                        <ns5:graphicData uri="http://schemas.microsoft.com/office/word/2010/wordprocessingShape">
-                          <ns6:wsp>
-                            <ns6:cNvCnPr/>
-                            <ns6:spPr>
-                              <ns5:xfrm>
-                                <ns5:off x="0" y="0"/>
-                                <ns5:ext cx="2181860" cy="0"/>
-                              </ns5:xfrm>
-                              <ns5:prstGeom prst="line">
-                                <ns5:avLst/>
-                              </ns5:prstGeom>
-                            </ns6:spPr>
-                            <ns6:style>
-                              <ns5:lnRef idx="1">
-                                <ns5:schemeClr val="dk1"/>
-                              </ns5:lnRef>
-                              <ns5:fillRef idx="0">
-                                <ns5:schemeClr val="dk1"/>
-                              </ns5:fillRef>
-                              <ns5:effectRef idx="0">
-                                <ns5:schemeClr val="dk1"/>
-                              </ns5:effectRef>
-                              <ns5:fontRef idx="minor">
-                                <ns5:schemeClr val="tx1"/>
-                              </ns5:fontRef>
-                            </ns6:style>
-                            <ns6:bodyPr/>
-                          </ns6:wsp>
-                        </ns5:graphicData>
-                      </ns5:graphic>
-                    </ns3:anchor>
+                    <wp:anchor distT="0" distB="0" distL="114300" distR="114300" simplePos="0" relativeHeight="251658240" behindDoc="0" locked="0" layoutInCell="1" allowOverlap="1" wp14:editId="7D0A8644">
+                      <wp:simplePos x="0" y="0"/>
+                      <wp:positionH relativeFrom="column">
+                        <wp:posOffset>755650</wp:posOffset>
+                      </wp:positionH>
+                      <wp:positionV relativeFrom="paragraph">
+                        <wp:posOffset>20955</wp:posOffset>
+                      </wp:positionV>
+                      <wp:extent cx="2181860" cy="0"/>
+                      <wp:effectExtent l="0" t="0" r="27940" b="19050"/>
+                      <wp:wrapNone/>
+                      <wp:docPr id="4" name="Straight Connector 4"/>
+                      <wp:cNvGraphicFramePr/>
+                      <a:graphic xmlns:a="http://schemas.openxmlformats.org/drawingml/2006/main">
+                        <a:graphicData uri="http://schemas.microsoft.com/office/word/2010/wordprocessingShape">
+                          <wps:wsp>
+                            <wps:cNvCnPr/>
+                            <wps:spPr>
+                              <a:xfrm>
+                                <a:off x="0" y="0"/>
+                                <a:ext cx="2181860" cy="0"/>
+                              </a:xfrm>
+                              <a:prstGeom prst="line">
+                                <a:avLst/>
+                              </a:prstGeom>
+                            </wps:spPr>
+                            <wps:style>
+                              <a:lnRef idx="1">
+                                <a:schemeClr val="dk1"/>
+                              </a:lnRef>
+                              <a:fillRef idx="0">
+                                <a:schemeClr val="dk1"/>
+                              </a:fillRef>
+                              <a:effectRef idx="0">
+                                <a:schemeClr val="dk1"/>
+                              </a:effectRef>
+                              <a:fontRef idx="minor">
+                                <a:schemeClr val="tx1"/>
+                              </a:fontRef>
+                            </wps:style>
+                            <wps:bodyPr/>
+                          </wps:wsp>
+                        </a:graphicData>
+                      </a:graphic>
+                    </wp:anchor>
                   </w:drawing>
-                </ns1:Choice>
-                <ns1:Fallback>
+                </mc:Choice>
+                <mc:Fallback>
                   <w:pict>
-                    <ns8:line id="Straight Connector 4" ns9:spid="_x0000_s1026" style="position:absolute;z-index:251658240;visibility:visible;mso-wrap-style:square;mso-wrap-distance-left:9pt;mso-wrap-distance-top:0;mso-wrap-distance-right:9pt;mso-wrap-distance-bottom:0;mso-position-horizontal:absolute;mso-position-horizontal-relative:text;mso-position-vertical:absolute;mso-position-vertical-relative:text" from="59.5pt,1.65pt" to="231.3pt,1.65pt" ns9:gfxdata="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" strokecolor="black [3040]"/>
+                    <v:line id="Straight Connector 4" o:spid="_x0000_s1026" style="position:absolute;z-index:251658240;visibility:visible;mso-wrap-style:square;mso-wrap-distance-left:9pt;mso-wrap-distance-top:0;mso-wrap-distance-right:9pt;mso-wrap-distance-bottom:0;mso-position-horizontal:absolute;mso-position-horizontal-relative:text;mso-position-vertical:absolute;mso-position-vertical-relative:text" from="59.5pt,1.65pt" to="231.3pt,1.65pt" o:gfxdata="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" strokecolor="black [3040]"/>
                   </w:pict>
-                </ns1:Fallback>
-              </ns1:AlternateContent>
-              <w:t xml:space="preserve">Phú Thọ, ngày {{NGAY_KY}} tháng {{THANG_KY}} năm {{NAM_KY}}</w:t>
+                </mc:Fallback>
+              </mc:AlternateContent>
             </w:r>
             <w:r>
               <w:rPr>
@@ -496,7 +414,7 @@
                 <w:szCs w:val="28"/>
                 <w:lang w:val="en-US"/>
               </w:rPr>
-              <w:t/>
+              <w:t>Phú Thọ</w:t>
             </w:r>
             <w:r>
               <w:rPr>
@@ -505,7 +423,7 @@
                 <w:sz w:val="28"/>
                 <w:szCs w:val="28"/>
               </w:rPr>
-              <w:t/>
+              <w:t>, ngày</w:t>
             </w:r>
             <w:r>
               <w:rPr>
@@ -515,7 +433,7 @@
                 <w:szCs w:val="28"/>
                 <w:lang w:val="en-US"/>
               </w:rPr>
-              <w:t xml:space="preserve"/>
+              <w:t xml:space="preserve"> 23</w:t>
             </w:r>
             <w:r>
               <w:rPr>
@@ -525,7 +443,7 @@
                 <w:szCs w:val="28"/>
                 <w:lang w:val="en-US"/>
               </w:rPr>
-              <w:t xml:space="preserve"/>
+              <w:t xml:space="preserve"> </w:t>
             </w:r>
             <w:r>
               <w:rPr>
@@ -534,7 +452,7 @@
                 <w:sz w:val="28"/>
                 <w:szCs w:val="28"/>
               </w:rPr>
-              <w:t/>
+              <w:t>thán</w:t>
             </w:r>
             <w:r>
               <w:rPr>
@@ -544,7 +462,7 @@
                 <w:szCs w:val="28"/>
                 <w:lang w:val="en-US"/>
               </w:rPr>
-              <w:t/>
+              <w:t>g</w:t>
             </w:r>
             <w:r>
               <w:rPr>
@@ -554,7 +472,7 @@
                 <w:szCs w:val="28"/>
                 <w:lang w:val="en-US"/>
               </w:rPr>
-              <w:t xml:space="preserve"/>
+              <w:t xml:space="preserve"> </w:t>
             </w:r>
             <w:r>
               <w:rPr>
@@ -564,7 +482,7 @@
                 <w:szCs w:val="28"/>
                 <w:lang w:val="en-US"/>
               </w:rPr>
-              <w:t/>
+              <w:t>04</w:t>
             </w:r>
             <w:r>
               <w:rPr>
@@ -574,7 +492,7 @@
                 <w:szCs w:val="28"/>
                 <w:lang w:val="en-US"/>
               </w:rPr>
-              <w:t xml:space="preserve"/>
+              <w:t xml:space="preserve"> </w:t>
             </w:r>
             <w:r>
               <w:rPr>
@@ -583,7 +501,7 @@
                 <w:sz w:val="28"/>
                 <w:szCs w:val="28"/>
               </w:rPr>
-              <w:t/>
+              <w:t>năm 20</w:t>
             </w:r>
             <w:r>
               <w:rPr>
@@ -593,7 +511,7 @@
                 <w:szCs w:val="28"/>
                 <w:lang w:val="en-US"/>
               </w:rPr>
-              <w:t/>
+              <w:t>2</w:t>
             </w:r>
             <w:r>
               <w:rPr>
@@ -603,13 +521,13 @@
                 <w:szCs w:val="28"/>
                 <w:lang w:val="en-US"/>
               </w:rPr>
-              <w:t/>
+              <w:t>6</w:t>
             </w:r>
           </w:p>
         </w:tc>
       </w:tr>
     </w:tbl>
-    <w:p ns2:paraId="19FBFA4E" ns2:textId="5CAE34FA">
+    <w:p>
       <w:pPr>
         <w:spacing w:before="480" w:after="60"/>
         <w:jc w:val="center"/>
@@ -631,7 +549,7 @@
         <w:t>QUYẾT ĐỊNH</w:t>
       </w:r>
     </w:p>
-    <w:p ns2:paraId="449B73E7" ns2:textId="72120A94">
+    <w:p>
       <w:pPr>
         <w:spacing w:after="0"/>
         <w:ind w:right="-1"/>
@@ -732,7 +650,7 @@
         <w:t>phục vụ công tác chuyên môn tại Bệnh viện đa khoa tỉnh Phú Thọ</w:t>
       </w:r>
     </w:p>
-    <w:p ns2:paraId="07063567" ns2:textId="4F452CE7">
+    <w:p>
       <w:pPr>
         <w:spacing w:after="0"/>
         <w:ind w:right="29"/>
@@ -753,65 +671,65 @@
           <w:szCs w:val="28"/>
           <w:lang w:val="en-US" w:eastAsia="en-US"/>
         </w:rPr>
-        <ns1:AlternateContent>
-          <ns1:Choice Requires="wps">
+        <mc:AlternateContent>
+          <mc:Choice Requires="wps">
             <w:drawing>
-              <ns3:anchor distT="0" distB="0" distL="114300" distR="114300" simplePos="0" relativeHeight="251659776" behindDoc="0" locked="0" layoutInCell="1" allowOverlap="1" ns4:editId="5636E121">
-                <ns3:simplePos x="0" y="0"/>
-                <ns3:positionH relativeFrom="column">
-                  <ns3:posOffset>2105025</ns3:posOffset>
-                </ns3:positionH>
-                <ns3:positionV relativeFrom="paragraph">
-                  <ns3:posOffset>6350</ns3:posOffset>
-                </ns3:positionV>
-                <ns3:extent cx="1524000" cy="0"/>
-                <ns3:effectExtent l="0" t="0" r="19050" b="19050"/>
-                <ns3:wrapNone/>
-                <ns3:docPr id="1593700247" name="Straight Connector 6"/>
-                <ns3:cNvGraphicFramePr/>
-                <ns5:graphic>
-                  <ns5:graphicData uri="http://schemas.microsoft.com/office/word/2010/wordprocessingShape">
-                    <ns6:wsp>
-                      <ns6:cNvCnPr/>
-                      <ns6:spPr>
-                        <ns5:xfrm>
-                          <ns5:off x="0" y="0"/>
-                          <ns5:ext cx="1524000" cy="0"/>
-                        </ns5:xfrm>
-                        <ns5:prstGeom prst="line">
-                          <ns5:avLst/>
-                        </ns5:prstGeom>
-                      </ns6:spPr>
-                      <ns6:style>
-                        <ns5:lnRef idx="1">
-                          <ns5:schemeClr val="dk1"/>
-                        </ns5:lnRef>
-                        <ns5:fillRef idx="0">
-                          <ns5:schemeClr val="dk1"/>
-                        </ns5:fillRef>
-                        <ns5:effectRef idx="0">
-                          <ns5:schemeClr val="dk1"/>
-                        </ns5:effectRef>
-                        <ns5:fontRef idx="minor">
-                          <ns5:schemeClr val="tx1"/>
-                        </ns5:fontRef>
-                      </ns6:style>
-                      <ns6:bodyPr/>
-                    </ns6:wsp>
-                  </ns5:graphicData>
-                </ns5:graphic>
-              </ns3:anchor>
+              <wp:anchor distT="0" distB="0" distL="114300" distR="114300" simplePos="0" relativeHeight="251659776" behindDoc="0" locked="0" layoutInCell="1" allowOverlap="1" wp14:editId="5636E121">
+                <wp:simplePos x="0" y="0"/>
+                <wp:positionH relativeFrom="column">
+                  <wp:posOffset>2105025</wp:posOffset>
+                </wp:positionH>
+                <wp:positionV relativeFrom="paragraph">
+                  <wp:posOffset>6350</wp:posOffset>
+                </wp:positionV>
+                <wp:extent cx="1524000" cy="0"/>
+                <wp:effectExtent l="0" t="0" r="19050" b="19050"/>
+                <wp:wrapNone/>
+                <wp:docPr id="1593700247" name="Straight Connector 6"/>
+                <wp:cNvGraphicFramePr/>
+                <a:graphic xmlns:a="http://schemas.openxmlformats.org/drawingml/2006/main">
+                  <a:graphicData uri="http://schemas.microsoft.com/office/word/2010/wordprocessingShape">
+                    <wps:wsp>
+                      <wps:cNvCnPr/>
+                      <wps:spPr>
+                        <a:xfrm>
+                          <a:off x="0" y="0"/>
+                          <a:ext cx="1524000" cy="0"/>
+                        </a:xfrm>
+                        <a:prstGeom prst="line">
+                          <a:avLst/>
+                        </a:prstGeom>
+                      </wps:spPr>
+                      <wps:style>
+                        <a:lnRef idx="1">
+                          <a:schemeClr val="dk1"/>
+                        </a:lnRef>
+                        <a:fillRef idx="0">
+                          <a:schemeClr val="dk1"/>
+                        </a:fillRef>
+                        <a:effectRef idx="0">
+                          <a:schemeClr val="dk1"/>
+                        </a:effectRef>
+                        <a:fontRef idx="minor">
+                          <a:schemeClr val="tx1"/>
+                        </a:fontRef>
+                      </wps:style>
+                      <wps:bodyPr/>
+                    </wps:wsp>
+                  </a:graphicData>
+                </a:graphic>
+              </wp:anchor>
             </w:drawing>
-          </ns1:Choice>
-          <ns1:Fallback>
+          </mc:Choice>
+          <mc:Fallback>
             <w:pict>
-              <ns8:line id="Straight Connector 6" ns9:spid="_x0000_s1026" style="position:absolute;z-index:251659776;visibility:visible;mso-wrap-style:square;mso-wrap-distance-left:9pt;mso-wrap-distance-top:0;mso-wrap-distance-right:9pt;mso-wrap-distance-bottom:0;mso-position-horizontal:absolute;mso-position-horizontal-relative:text;mso-position-vertical:absolute;mso-position-vertical-relative:text" from="165.75pt,.5pt" to="285.75pt,.5pt" ns9:gfxdata="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" strokecolor="black [3040]"/>
+              <v:line id="Straight Connector 6" o:spid="_x0000_s1026" style="position:absolute;z-index:251659776;visibility:visible;mso-wrap-style:square;mso-wrap-distance-left:9pt;mso-wrap-distance-top:0;mso-wrap-distance-right:9pt;mso-wrap-distance-bottom:0;mso-position-horizontal:absolute;mso-position-horizontal-relative:text;mso-position-vertical:absolute;mso-position-vertical-relative:text" from="165.75pt,.5pt" to="285.75pt,.5pt" o:gfxdata="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" strokecolor="black [3040]"/>
             </w:pict>
-          </ns1:Fallback>
-        </ns1:AlternateContent>
+          </mc:Fallback>
+        </mc:AlternateContent>
       </w:r>
     </w:p>
-    <w:p ns2:paraId="0BEDE345" ns2:textId="1C503BB4">
+    <w:p>
       <w:pPr>
         <w:spacing w:after="240"/>
         <w:jc w:val="center"/>
@@ -834,7 +752,7 @@
         <w:t>GIÁM ĐỐC BỆNH VIỆN ĐA KHOA TỈNH PHÚ THỌ</w:t>
       </w:r>
     </w:p>
-    <w:p ns2:paraId="2FBC2087" ns2:textId="27E622C6">
+    <w:p>
       <w:pPr>
         <w:spacing w:after="0" w:line="312" w:lineRule="auto"/>
         <w:ind w:firstLine="567"/>
@@ -866,7 +784,7 @@
         <w:t xml:space="preserve"> chính ngày 29/11/2024;</w:t>
       </w:r>
     </w:p>
-    <w:p ns2:paraId="47399AC4" ns2:textId="631934CF">
+    <w:p>
       <w:pPr>
         <w:pStyle w:val="BodyText"/>
         <w:spacing w:line="312" w:lineRule="auto"/>
@@ -908,7 +826,7 @@
         <w:t xml:space="preserve"> </w:t>
       </w:r>
     </w:p>
-    <w:p ns2:paraId="07F319AA" ns2:textId="73933DFC">
+    <w:p>
       <w:pPr>
         <w:pStyle w:val="BodyText"/>
         <w:spacing w:line="312" w:lineRule="auto"/>
@@ -932,7 +850,7 @@
         <w:t>Căn cứ Luật Khám bệnh, chữa bệnh ngày 09/01/2023;</w:t>
       </w:r>
     </w:p>
-    <w:p ns2:paraId="5E570723" ns2:textId="1F79F908">
+    <w:p>
       <w:pPr>
         <w:pStyle w:val="BodyText"/>
         <w:spacing w:line="312" w:lineRule="auto"/>
@@ -963,7 +881,7 @@
         <w:t>;</w:t>
       </w:r>
     </w:p>
-    <w:p ns2:paraId="284829E1" ns2:textId="77777777">
+    <w:p>
       <w:pPr>
         <w:spacing w:after="0" w:line="312" w:lineRule="auto"/>
         <w:ind w:firstLine="562"/>
@@ -985,7 +903,7 @@
         <w:t>Căn cứ Nghị định số 214/2025/NĐ-CP ngày 04/8/2025 của Chính phủ quy định chi tiết một số điều và biện pháp thi hành Luật Đấu thầu về lựa chọn nhà thầu;</w:t>
       </w:r>
     </w:p>
-    <w:p ns2:paraId="6148B212" ns2:textId="77777777">
+    <w:p>
       <w:pPr>
         <w:pStyle w:val="BodyText"/>
         <w:spacing w:line="312" w:lineRule="auto"/>
@@ -1009,7 +927,7 @@
         <w:t>Căn cứ Nghị định số 96/2023/NĐ-CP ngày 30/12/2023 của Chính Phủ quy định chi tiết một số điều của Luật khám bệnh, chữa bệnh;</w:t>
       </w:r>
     </w:p>
-    <w:p ns2:paraId="574C7918" ns2:textId="5215E8BD">
+    <w:p>
       <w:pPr>
         <w:pStyle w:val="BodyText"/>
         <w:spacing w:line="312" w:lineRule="auto"/>
@@ -1050,7 +968,7 @@
         <w:t>;</w:t>
       </w:r>
     </w:p>
-    <w:p ns2:paraId="1B76E85C" ns2:textId="77777777">
+    <w:p>
       <w:pPr>
         <w:pStyle w:val="BodyText"/>
         <w:spacing w:line="312" w:lineRule="auto"/>
@@ -1074,7 +992,7 @@
         <w:t>Căn cứ Nghị định số 60/2021/NĐ-CP ngày 21/6/2021 của Chính phủ về quy định cơ chế tự chủ tài chính của đơn vị sự nghiệp công lập;</w:t>
       </w:r>
     </w:p>
-    <w:p ns2:paraId="3BBCCE0A" ns2:textId="77777777">
+    <w:p>
       <w:pPr>
         <w:pStyle w:val="BodyText"/>
         <w:spacing w:line="312" w:lineRule="auto"/>
@@ -1098,7 +1016,7 @@
         <w:t>Căn cứ Nghị định số 98/2021/NĐ-CP ngày 08/11/2021 của Chính phủ về quản lý trang thiết bị y tế; Thông tư số 05/2022/TT-BYT ngày 01/8/2022 của Bộ Y tế quy định chi tiết thi hành một số điều của Nghị định số 98/2021/NĐ-CP ngày 08/11/2021 của Chính phủ về quản lý trang thiết bị y tế; Nghị định số 07/2023/NĐ-CP ngày 03/03/2023 của Chính phủ sửa đổi, bổ sung một số điều của Nghị định 98/2021/NĐ-CP ngày 08/11/2021 của Chính phủ về Quản lý trang thiết bị y tế;</w:t>
       </w:r>
     </w:p>
-    <w:p ns2:paraId="3474EE44" ns2:textId="69B7A9E9">
+    <w:p>
       <w:pPr>
         <w:pStyle w:val="BodyText"/>
         <w:spacing w:line="312" w:lineRule="auto"/>
@@ -1296,7 +1214,7 @@
         <w:t>;</w:t>
       </w:r>
     </w:p>
-    <w:p ns2:paraId="4FCEBAC8" ns2:textId="1AF2B5BE">
+    <w:p>
       <w:pPr>
         <w:spacing w:after="0" w:line="312" w:lineRule="auto"/>
         <w:ind w:firstLine="562"/>
@@ -1319,7 +1237,7 @@
         <w:t>Căn cứ Thông tư số 79/2025/TT-BTC ngày 04/08/2025 của Bộ Tài Chính hướng dẫn việc cung cấp, đăng tải thông tin về đấu thầu và mẫu hồ sơ đấu thầu trên Hệ thống mạng đấu thầu quốc gia;</w:t>
       </w:r>
     </w:p>
-    <w:p ns2:paraId="0809E7E3" ns2:textId="77777777">
+    <w:p>
       <w:pPr>
         <w:spacing w:after="0" w:line="312" w:lineRule="auto"/>
         <w:ind w:firstLine="567"/>
@@ -1341,7 +1259,7 @@
         <w:t>Căn cứ Nghị quyết số 17/2025/NQ-HĐND ngày 17/9/2025 của Hội đồng nhân dân tỉnh Phú Thọ quy định thẩm quyền quyết định phê duyệt nhiệm vụ và dự toán kinh phí thực hiện chi thường xuyên ngân sách nhà nước để mua sắm, sửa chữa, cải tạo, nâng cấp tài sản, trang thiết bị; chi thuê hàng hóa, dịch vụ; sửa chữa cải tạo, nâng cấp, mở rộng, xây dựng mới hạng mục công trình trong các dự án đã đầu tư xây dựng thuộc phạm vi quản lý của tỉnh Phú Thọ;</w:t>
       </w:r>
     </w:p>
-    <w:p ns2:paraId="7F11AF3A" ns2:textId="77777777">
+    <w:p>
       <w:pPr>
         <w:spacing w:after="0" w:line="312" w:lineRule="auto"/>
         <w:ind w:firstLine="567"/>
@@ -1365,7 +1283,7 @@
         <w:t>Quyết định số 42/2025/QĐ-CTUBND ngày 20/9/2025 của Chủ tịch UBND tỉnh Phú Thọ phân cấp thẩm quyền quyết định quản lý tài sản công tại các cơ quan, tổ chức, đơn vị thuộc phạm vi quản lý của tỉnh Phú Thọ;</w:t>
       </w:r>
     </w:p>
-    <w:p ns2:paraId="1EA0FCD5" ns2:textId="647C3403">
+    <w:p>
       <w:pPr>
         <w:pStyle w:val="BodyText"/>
         <w:spacing w:line="312" w:lineRule="auto"/>
@@ -1385,7 +1303,7 @@
           <w:szCs w:val="28"/>
           <w:lang w:val="nl-NL"/>
         </w:rPr>
-        <w:t xml:space="preserve">Quyết định số 47/2025/QĐ-CTUBND ngày {{NGAY_QD_KQLCNT_THAM_CHIEU}} của Chủ tịch UBND tỉnh Phú Thọ </w:t>
+        <w:t xml:space="preserve">Quyết định số 47/2025/QĐ-CTUBND ngày 25/9/2025 của Chủ tịch UBND tỉnh Phú Thọ </w:t>
       </w:r>
       <w:bookmarkStart w:id="0" w:name="loai_1_name"/>
       <w:r>
@@ -1409,7 +1327,7 @@
         <w:t>;</w:t>
       </w:r>
     </w:p>
-    <w:p ns2:paraId="21103B7E" ns2:textId="79CEA6DA">
+    <w:p>
       <w:pPr>
         <w:pStyle w:val="BodyText"/>
         <w:spacing w:line="312" w:lineRule="auto"/>
@@ -1441,7 +1359,7 @@
         <w:t>;</w:t>
       </w:r>
     </w:p>
-    <w:p ns2:paraId="06C70886" ns2:textId="6DB278B3">
+    <w:p>
       <w:pPr>
         <w:pStyle w:val="BodyText"/>
         <w:spacing w:line="312" w:lineRule="auto"/>
@@ -1473,7 +1391,7 @@
         <w:t>;</w:t>
       </w:r>
     </w:p>
-    <w:p ns2:paraId="1C9EB58E" ns2:textId="77777777">
+    <w:p>
       <w:pPr>
         <w:pStyle w:val="BodyText"/>
         <w:spacing w:line="312" w:lineRule="auto"/>
@@ -1519,7 +1437,7 @@
         <w:t>;</w:t>
       </w:r>
     </w:p>
-    <w:p ns2:paraId="50D8D736" ns2:textId="671A343E">
+    <w:p>
       <w:pPr>
         <w:spacing w:after="0" w:line="312" w:lineRule="auto"/>
         <w:ind w:firstLine="540"/>
@@ -1541,48 +1459,48 @@
           <w:sz w:val="28"/>
           <w:szCs w:val="28"/>
         </w:rPr>
-        <w:t xml:space="preserve">Căn cứ Quyết định số {{SO_QD_KIEN_TOAN_TCG}}/QĐ-BV ngày {{NGAY_QD_KIEN_TOAN_TCG}} của Giám đốc Bệnh viện đa khoa tỉnh Phú Thọ về việc kiện toàn Tổ chuyên gia đấu thầu các gói thầu Mua sắm thiết bị y tế, vật tư tiêu hao, hóa chất xét nghiệm phục vụ công tác khám chữa bệnh tại Bệnh viện đa khoa tỉnh Phú Thọ;</w:t>
-      </w:r>
-      <w:r>
-        <w:rPr>
-          <w:rFonts w:ascii="Times New Roman" w:hAnsi="Times New Roman" w:cs="Times New Roman"/>
-          <w:i/>
-          <w:iCs/>
-          <w:sz w:val="28"/>
-          <w:szCs w:val="28"/>
-          <w:lang w:val="en-US"/>
-        </w:rPr>
-        <w:t/>
-      </w:r>
-      <w:r>
-        <w:rPr>
-          <w:rFonts w:ascii="Times New Roman" w:hAnsi="Times New Roman" w:cs="Times New Roman"/>
-          <w:i/>
-          <w:iCs/>
-          <w:sz w:val="28"/>
-          <w:szCs w:val="28"/>
-        </w:rPr>
-        <w:t/>
-      </w:r>
-      <w:r>
-        <w:rPr>
-          <w:rFonts w:ascii="Times New Roman" w:hAnsi="Times New Roman" w:cs="Times New Roman"/>
-          <w:i/>
-          <w:iCs/>
-          <w:sz w:val="28"/>
-          <w:szCs w:val="28"/>
-        </w:rPr>
-        <w:t/>
-      </w:r>
-      <w:r>
-        <w:rPr>
-          <w:rFonts w:ascii="Times New Roman" w:hAnsi="Times New Roman" w:cs="Times New Roman"/>
-          <w:i/>
-          <w:iCs/>
-          <w:sz w:val="28"/>
-          <w:szCs w:val="28"/>
-        </w:rPr>
-        <w:t xml:space="preserve"/>
+        <w:t xml:space="preserve">Căn cứ Quyết định số </w:t>
+      </w:r>
+      <w:r>
+        <w:rPr>
+          <w:rFonts w:ascii="Times New Roman" w:hAnsi="Times New Roman" w:cs="Times New Roman"/>
+          <w:i/>
+          <w:iCs/>
+          <w:sz w:val="28"/>
+          <w:szCs w:val="28"/>
+          <w:lang w:val="en-US"/>
+        </w:rPr>
+        <w:t>2054</w:t>
+      </w:r>
+      <w:r>
+        <w:rPr>
+          <w:rFonts w:ascii="Times New Roman" w:hAnsi="Times New Roman" w:cs="Times New Roman"/>
+          <w:i/>
+          <w:iCs/>
+          <w:sz w:val="28"/>
+          <w:szCs w:val="28"/>
+        </w:rPr>
+        <w:t>/QĐ-BV ngày 20/04</w:t>
+      </w:r>
+      <w:r>
+        <w:rPr>
+          <w:rFonts w:ascii="Times New Roman" w:hAnsi="Times New Roman" w:cs="Times New Roman"/>
+          <w:i/>
+          <w:iCs/>
+          <w:sz w:val="28"/>
+          <w:szCs w:val="28"/>
+        </w:rPr>
+        <w:t>/2026</w:t>
+      </w:r>
+      <w:r>
+        <w:rPr>
+          <w:rFonts w:ascii="Times New Roman" w:hAnsi="Times New Roman" w:cs="Times New Roman"/>
+          <w:i/>
+          <w:iCs/>
+          <w:sz w:val="28"/>
+          <w:szCs w:val="28"/>
+        </w:rPr>
+        <w:t xml:space="preserve"> của Giám đốc Bệnh viện </w:t>
       </w:r>
       <w:r>
         <w:rPr>
@@ -1592,10 +1510,10 @@
           <w:sz w:val="28"/>
           <w:szCs w:val="28"/>
         </w:rPr>
-        <w:t/>
+        <w:t>đa khoa tỉnh Phú Thọ về việc kiện toàn Tổ chuyên gia đấu thầu các gói thầu Mua sắm thiết bị y tế, vật tư tiêu hao, hóa chất xét nghiệm phục vụ công tác khám chữa bệnh tại Bệnh viện đa khoa tỉnh Phú Thọ;</w:t>
       </w:r>
     </w:p>
-    <w:p ns2:paraId="4D6F3E86" ns2:textId="0A928807">
+    <w:p>
       <w:pPr>
         <w:spacing w:after="0" w:line="312" w:lineRule="auto"/>
         <w:ind w:firstLine="567"/>
@@ -1620,87 +1538,87 @@
           <w:szCs w:val="28"/>
         </w:rPr>
         <w:lastRenderedPageBreak/>
-        <w:t xml:space="preserve">Căn cứ Quyết định số {{SO_QD_CHU_TRUONG}}/QĐ-BV ngày {{NGAY_QD_CHU_TRUONG}} của Giám đốc Bệnh viện đa khoa tỉnh Phú Thọ về việc phê duyệt chủ trương đầu tư mua sắm băng ghim và dụng cụ cắt khâu nối dùng trong phẫu thuật phục vụ công tác chuyên môn tại Bệnh viện đa khoa tỉnh Phú Thọ;</w:t>
-      </w:r>
-      <w:r>
-        <w:rPr>
-          <w:rFonts w:ascii="Times New Roman" w:hAnsi="Times New Roman" w:cs="Times New Roman"/>
-          <w:bCs/>
-          <w:i/>
-          <w:iCs/>
-          <w:sz w:val="28"/>
-          <w:szCs w:val="28"/>
-          <w:lang w:val="en-US"/>
-        </w:rPr>
-        <w:t xml:space="preserve"/>
-      </w:r>
-      <w:r>
-        <w:rPr>
-          <w:rFonts w:ascii="Times New Roman" w:hAnsi="Times New Roman" w:cs="Times New Roman"/>
-          <w:bCs/>
-          <w:i/>
-          <w:iCs/>
-          <w:sz w:val="28"/>
-          <w:szCs w:val="28"/>
-        </w:rPr>
-        <w:t xml:space="preserve"/>
-      </w:r>
-      <w:r>
-        <w:rPr>
-          <w:rFonts w:ascii="Times New Roman" w:hAnsi="Times New Roman" w:cs="Times New Roman"/>
-          <w:bCs/>
-          <w:i/>
-          <w:iCs/>
-          <w:sz w:val="28"/>
-          <w:szCs w:val="28"/>
-          <w:lang w:val="en-US"/>
-        </w:rPr>
-        <w:t/>
-      </w:r>
-      <w:r>
-        <w:rPr>
-          <w:rFonts w:ascii="Times New Roman" w:hAnsi="Times New Roman" w:cs="Times New Roman"/>
-          <w:bCs/>
-          <w:i/>
-          <w:iCs/>
-          <w:sz w:val="28"/>
-          <w:szCs w:val="28"/>
-        </w:rPr>
-        <w:t/>
-      </w:r>
-      <w:r>
-        <w:rPr>
-          <w:rFonts w:ascii="Times New Roman" w:hAnsi="Times New Roman" w:cs="Times New Roman"/>
-          <w:bCs/>
-          <w:i/>
-          <w:iCs/>
-          <w:sz w:val="28"/>
-          <w:szCs w:val="28"/>
-        </w:rPr>
-        <w:t/>
-      </w:r>
-      <w:r>
-        <w:rPr>
-          <w:rFonts w:ascii="Times New Roman" w:hAnsi="Times New Roman" w:cs="Times New Roman"/>
-          <w:bCs/>
-          <w:i/>
-          <w:iCs/>
-          <w:sz w:val="28"/>
-          <w:szCs w:val="28"/>
-        </w:rPr>
-        <w:t xml:space="preserve"/>
-      </w:r>
-      <w:r>
-        <w:rPr>
-          <w:rFonts w:ascii="Times New Roman" w:hAnsi="Times New Roman" w:cs="Times New Roman"/>
-          <w:bCs/>
-          <w:i/>
-          <w:iCs/>
-          <w:sz w:val="28"/>
-          <w:szCs w:val="28"/>
-          <w:lang w:val="en-US"/>
-        </w:rPr>
-        <w:t/>
+        <w:t>Căn cứ Quyết định số</w:t>
+      </w:r>
+      <w:r>
+        <w:rPr>
+          <w:rFonts w:ascii="Times New Roman" w:hAnsi="Times New Roman" w:cs="Times New Roman"/>
+          <w:bCs/>
+          <w:i/>
+          <w:iCs/>
+          <w:sz w:val="28"/>
+          <w:szCs w:val="28"/>
+          <w:lang w:val="en-US"/>
+        </w:rPr>
+        <w:t xml:space="preserve"> 1191</w:t>
+      </w:r>
+      <w:r>
+        <w:rPr>
+          <w:rFonts w:ascii="Times New Roman" w:hAnsi="Times New Roman" w:cs="Times New Roman"/>
+          <w:bCs/>
+          <w:i/>
+          <w:iCs/>
+          <w:sz w:val="28"/>
+          <w:szCs w:val="28"/>
+        </w:rPr>
+        <w:t xml:space="preserve">/QĐ-BV ngày </w:t>
+      </w:r>
+      <w:r>
+        <w:rPr>
+          <w:rFonts w:ascii="Times New Roman" w:hAnsi="Times New Roman" w:cs="Times New Roman"/>
+          <w:bCs/>
+          <w:i/>
+          <w:iCs/>
+          <w:sz w:val="28"/>
+          <w:szCs w:val="28"/>
+          <w:lang w:val="en-US"/>
+        </w:rPr>
+        <w:t>16</w:t>
+      </w:r>
+      <w:r>
+        <w:rPr>
+          <w:rFonts w:ascii="Times New Roman" w:hAnsi="Times New Roman" w:cs="Times New Roman"/>
+          <w:bCs/>
+          <w:i/>
+          <w:iCs/>
+          <w:sz w:val="28"/>
+          <w:szCs w:val="28"/>
+        </w:rPr>
+        <w:t>/03</w:t>
+      </w:r>
+      <w:r>
+        <w:rPr>
+          <w:rFonts w:ascii="Times New Roman" w:hAnsi="Times New Roman" w:cs="Times New Roman"/>
+          <w:bCs/>
+          <w:i/>
+          <w:iCs/>
+          <w:sz w:val="28"/>
+          <w:szCs w:val="28"/>
+        </w:rPr>
+        <w:t>/2026</w:t>
+      </w:r>
+      <w:r>
+        <w:rPr>
+          <w:rFonts w:ascii="Times New Roman" w:hAnsi="Times New Roman" w:cs="Times New Roman"/>
+          <w:bCs/>
+          <w:i/>
+          <w:iCs/>
+          <w:sz w:val="28"/>
+          <w:szCs w:val="28"/>
+        </w:rPr>
+        <w:t xml:space="preserve"> của Giám đốc Bệnh viện đa khoa tỉnh Phú Thọ về việc phê duyệt chủ trương đầu tư </w:t>
+      </w:r>
+      <w:r>
+        <w:rPr>
+          <w:rFonts w:ascii="Times New Roman" w:hAnsi="Times New Roman" w:cs="Times New Roman"/>
+          <w:bCs/>
+          <w:i/>
+          <w:iCs/>
+          <w:sz w:val="28"/>
+          <w:szCs w:val="28"/>
+          <w:lang w:val="en-US"/>
+        </w:rPr>
+        <w:t>m</w:t>
       </w:r>
       <w:r>
         <w:rPr>
@@ -1711,7 +1629,7 @@
           <w:sz w:val="28"/>
           <w:szCs w:val="28"/>
         </w:rPr>
-        <w:t/>
+        <w:t>ua sắ</w:t>
       </w:r>
       <w:r>
         <w:rPr>
@@ -1723,51 +1641,51 @@
           <w:szCs w:val="28"/>
           <w:lang w:val="en-US"/>
         </w:rPr>
-        <w:t/>
-      </w:r>
-      <w:r>
-        <w:rPr>
-          <w:rFonts w:ascii="Times New Roman" w:hAnsi="Times New Roman" w:cs="Times New Roman"/>
-          <w:bCs/>
-          <w:i/>
-          <w:iCs/>
-          <w:sz w:val="28"/>
-          <w:szCs w:val="28"/>
-        </w:rPr>
-        <w:t xml:space="preserve"/>
-      </w:r>
-      <w:r>
-        <w:rPr>
-          <w:rFonts w:ascii="Times New Roman" w:hAnsi="Times New Roman" w:cs="Times New Roman"/>
-          <w:bCs/>
-          <w:i/>
-          <w:iCs/>
-          <w:sz w:val="28"/>
-          <w:szCs w:val="28"/>
-        </w:rPr>
-        <w:t xml:space="preserve"/>
-      </w:r>
-      <w:r>
-        <w:rPr>
-          <w:rFonts w:ascii="Times New Roman" w:hAnsi="Times New Roman" w:cs="Times New Roman"/>
-          <w:bCs/>
-          <w:i/>
-          <w:iCs/>
-          <w:sz w:val="28"/>
-          <w:szCs w:val="28"/>
-        </w:rPr>
-        <w:t/>
-      </w:r>
-      <w:r>
-        <w:rPr>
-          <w:rFonts w:ascii="Times New Roman" w:hAnsi="Times New Roman" w:cs="Times New Roman"/>
-          <w:bCs/>
-          <w:i/>
-          <w:iCs/>
-          <w:sz w:val="28"/>
-          <w:szCs w:val="28"/>
-        </w:rPr>
-        <w:t xml:space="preserve"/>
+        <w:t>m</w:t>
+      </w:r>
+      <w:r>
+        <w:rPr>
+          <w:rFonts w:ascii="Times New Roman" w:hAnsi="Times New Roman" w:cs="Times New Roman"/>
+          <w:bCs/>
+          <w:i/>
+          <w:iCs/>
+          <w:sz w:val="28"/>
+          <w:szCs w:val="28"/>
+        </w:rPr>
+        <w:t xml:space="preserve"> băng ghim và dụng cụ cắt khâu nối dùng trong phẫu thuật</w:t>
+      </w:r>
+      <w:r>
+        <w:rPr>
+          <w:rFonts w:ascii="Times New Roman" w:hAnsi="Times New Roman" w:cs="Times New Roman"/>
+          <w:bCs/>
+          <w:i/>
+          <w:iCs/>
+          <w:sz w:val="28"/>
+          <w:szCs w:val="28"/>
+        </w:rPr>
+        <w:t xml:space="preserve"> </w:t>
+      </w:r>
+      <w:r>
+        <w:rPr>
+          <w:rFonts w:ascii="Times New Roman" w:hAnsi="Times New Roman" w:cs="Times New Roman"/>
+          <w:bCs/>
+          <w:i/>
+          <w:iCs/>
+          <w:sz w:val="28"/>
+          <w:szCs w:val="28"/>
+        </w:rPr>
+        <w:t>phục vụ công tác chuyên môn</w:t>
+      </w:r>
+      <w:r>
+        <w:rPr>
+          <w:rFonts w:ascii="Times New Roman" w:hAnsi="Times New Roman" w:cs="Times New Roman"/>
+          <w:bCs/>
+          <w:i/>
+          <w:iCs/>
+          <w:sz w:val="28"/>
+          <w:szCs w:val="28"/>
+        </w:rPr>
+        <w:t xml:space="preserve"> tại Bệnh viện đa khoa tỉnh Phú Thọ</w:t>
       </w:r>
       <w:r>
         <w:rPr>
@@ -1779,10 +1697,10 @@
           <w:szCs w:val="28"/>
           <w:lang w:val="sv-SE"/>
         </w:rPr>
-        <w:t/>
+        <w:t>;</w:t>
       </w:r>
     </w:p>
-    <w:p ns2:paraId="65ACE962" ns2:textId="27C87D3B">
+    <w:p>
       <w:pPr>
         <w:spacing w:after="0" w:line="312" w:lineRule="auto"/>
         <w:ind w:firstLine="567"/>
@@ -1805,112 +1723,112 @@
           <w:sz w:val="28"/>
           <w:szCs w:val="28"/>
         </w:rPr>
-        <w:t xml:space="preserve">Căn cứ Biên bản họp ngày {{NGAY_BB_HDKH}} của Hội đồng khoa học Bệnh viện về việc xây dựng, thống nhất các nội dung về danh mục, số lượng, tiêu chí kỹ thuật hạng mục: Mua sắm băng ghim và dụng cụ cắt khâu nối dùng trong phẫu thuật phục vụ công tác chuyên môn tại Bệnh viện đa khoa tỉnh Phú Thọ;</w:t>
-      </w:r>
-      <w:r>
-        <w:rPr>
-          <w:rFonts w:ascii="Times New Roman" w:hAnsi="Times New Roman" w:cs="Times New Roman"/>
-          <w:i/>
-          <w:iCs/>
-          <w:sz w:val="28"/>
-          <w:szCs w:val="28"/>
-          <w:lang w:val="en-US"/>
-        </w:rPr>
-        <w:t/>
-      </w:r>
-      <w:r>
-        <w:rPr>
-          <w:rFonts w:ascii="Times New Roman" w:hAnsi="Times New Roman" w:cs="Times New Roman"/>
-          <w:i/>
-          <w:iCs/>
-          <w:sz w:val="28"/>
-          <w:szCs w:val="28"/>
-        </w:rPr>
-        <w:t/>
-      </w:r>
-      <w:r>
-        <w:rPr>
-          <w:rFonts w:ascii="Times New Roman" w:hAnsi="Times New Roman" w:cs="Times New Roman"/>
-          <w:i/>
-          <w:iCs/>
-          <w:sz w:val="28"/>
-          <w:szCs w:val="28"/>
-        </w:rPr>
-        <w:t/>
-      </w:r>
-      <w:r>
-        <w:rPr>
-          <w:rFonts w:ascii="Times New Roman" w:hAnsi="Times New Roman" w:cs="Times New Roman"/>
-          <w:i/>
-          <w:iCs/>
-          <w:sz w:val="28"/>
-          <w:szCs w:val="28"/>
-        </w:rPr>
-        <w:t xml:space="preserve"/>
-      </w:r>
-      <w:r>
-        <w:rPr>
-          <w:rFonts w:ascii="Times New Roman" w:hAnsi="Times New Roman" w:cs="Times New Roman"/>
-          <w:i/>
-          <w:iCs/>
-          <w:sz w:val="28"/>
-          <w:szCs w:val="28"/>
-          <w:lang w:val="en-US"/>
-        </w:rPr>
-        <w:t/>
-      </w:r>
-      <w:r>
-        <w:rPr>
-          <w:rFonts w:ascii="Times New Roman" w:hAnsi="Times New Roman" w:cs="Times New Roman"/>
-          <w:i/>
-          <w:iCs/>
-          <w:sz w:val="28"/>
-          <w:szCs w:val="28"/>
-        </w:rPr>
-        <w:t xml:space="preserve"/>
-      </w:r>
-      <w:r>
-        <w:rPr>
-          <w:rFonts w:ascii="Times New Roman" w:hAnsi="Times New Roman" w:cs="Times New Roman"/>
-          <w:i/>
-          <w:iCs/>
-          <w:sz w:val="28"/>
-          <w:szCs w:val="28"/>
-          <w:lang w:val="en-US"/>
-        </w:rPr>
-        <w:t/>
-      </w:r>
-      <w:r>
-        <w:rPr>
-          <w:rFonts w:ascii="Times New Roman" w:hAnsi="Times New Roman" w:cs="Times New Roman"/>
-          <w:i/>
-          <w:iCs/>
-          <w:sz w:val="28"/>
-          <w:szCs w:val="28"/>
-        </w:rPr>
-        <w:t xml:space="preserve"/>
-      </w:r>
-      <w:r>
-        <w:rPr>
-          <w:rFonts w:ascii="Times New Roman" w:hAnsi="Times New Roman" w:cs="Times New Roman"/>
-          <w:i/>
-          <w:iCs/>
-          <w:sz w:val="28"/>
-          <w:szCs w:val="28"/>
-          <w:lang w:val="en-US"/>
-        </w:rPr>
-        <w:t xml:space="preserve"/>
-      </w:r>
-      <w:r>
-        <w:rPr>
-          <w:rFonts w:ascii="Times New Roman" w:hAnsi="Times New Roman" w:cs="Times New Roman"/>
-          <w:bCs/>
-          <w:i/>
-          <w:iCs/>
-          <w:sz w:val="28"/>
-          <w:szCs w:val="28"/>
-        </w:rPr>
-        <w:t/>
+        <w:t xml:space="preserve">Căn cứ Biên bản họp ngày </w:t>
+      </w:r>
+      <w:r>
+        <w:rPr>
+          <w:rFonts w:ascii="Times New Roman" w:hAnsi="Times New Roman" w:cs="Times New Roman"/>
+          <w:i/>
+          <w:iCs/>
+          <w:sz w:val="28"/>
+          <w:szCs w:val="28"/>
+          <w:lang w:val="en-US"/>
+        </w:rPr>
+        <w:t>24</w:t>
+      </w:r>
+      <w:r>
+        <w:rPr>
+          <w:rFonts w:ascii="Times New Roman" w:hAnsi="Times New Roman" w:cs="Times New Roman"/>
+          <w:i/>
+          <w:iCs/>
+          <w:sz w:val="28"/>
+          <w:szCs w:val="28"/>
+        </w:rPr>
+        <w:t>/03</w:t>
+      </w:r>
+      <w:r>
+        <w:rPr>
+          <w:rFonts w:ascii="Times New Roman" w:hAnsi="Times New Roman" w:cs="Times New Roman"/>
+          <w:i/>
+          <w:iCs/>
+          <w:sz w:val="28"/>
+          <w:szCs w:val="28"/>
+        </w:rPr>
+        <w:t>/2026</w:t>
+      </w:r>
+      <w:r>
+        <w:rPr>
+          <w:rFonts w:ascii="Times New Roman" w:hAnsi="Times New Roman" w:cs="Times New Roman"/>
+          <w:i/>
+          <w:iCs/>
+          <w:sz w:val="28"/>
+          <w:szCs w:val="28"/>
+        </w:rPr>
+        <w:t xml:space="preserve"> của Hội đồng khoa học Bệnh viện về việc xây dựng</w:t>
+      </w:r>
+      <w:r>
+        <w:rPr>
+          <w:rFonts w:ascii="Times New Roman" w:hAnsi="Times New Roman" w:cs="Times New Roman"/>
+          <w:i/>
+          <w:iCs/>
+          <w:sz w:val="28"/>
+          <w:szCs w:val="28"/>
+          <w:lang w:val="en-US"/>
+        </w:rPr>
+        <w:t>, thống nhất</w:t>
+      </w:r>
+      <w:r>
+        <w:rPr>
+          <w:rFonts w:ascii="Times New Roman" w:hAnsi="Times New Roman" w:cs="Times New Roman"/>
+          <w:i/>
+          <w:iCs/>
+          <w:sz w:val="28"/>
+          <w:szCs w:val="28"/>
+        </w:rPr>
+        <w:t xml:space="preserve"> các nội dung về danh mục, số lượng, tiêu chí kỹ thuậ</w:t>
+      </w:r>
+      <w:r>
+        <w:rPr>
+          <w:rFonts w:ascii="Times New Roman" w:hAnsi="Times New Roman" w:cs="Times New Roman"/>
+          <w:i/>
+          <w:iCs/>
+          <w:sz w:val="28"/>
+          <w:szCs w:val="28"/>
+          <w:lang w:val="en-US"/>
+        </w:rPr>
+        <w:t>t</w:t>
+      </w:r>
+      <w:r>
+        <w:rPr>
+          <w:rFonts w:ascii="Times New Roman" w:hAnsi="Times New Roman" w:cs="Times New Roman"/>
+          <w:i/>
+          <w:iCs/>
+          <w:sz w:val="28"/>
+          <w:szCs w:val="28"/>
+        </w:rPr>
+        <w:t xml:space="preserve"> hạng mục</w:t>
+      </w:r>
+      <w:r>
+        <w:rPr>
+          <w:rFonts w:ascii="Times New Roman" w:hAnsi="Times New Roman" w:cs="Times New Roman"/>
+          <w:i/>
+          <w:iCs/>
+          <w:sz w:val="28"/>
+          <w:szCs w:val="28"/>
+          <w:lang w:val="en-US"/>
+        </w:rPr>
+        <w:t xml:space="preserve">: </w:t>
+      </w:r>
+      <w:r>
+        <w:rPr>
+          <w:rFonts w:ascii="Times New Roman" w:hAnsi="Times New Roman" w:cs="Times New Roman"/>
+          <w:bCs/>
+          <w:i/>
+          <w:iCs/>
+          <w:sz w:val="28"/>
+          <w:szCs w:val="28"/>
+        </w:rPr>
+        <w:t>M</w:t>
       </w:r>
       <w:r>
         <w:rPr>
@@ -1921,7 +1839,7 @@
           <w:sz w:val="28"/>
           <w:szCs w:val="28"/>
         </w:rPr>
-        <w:t/>
+        <w:t>ua sắ</w:t>
       </w:r>
       <w:r>
         <w:rPr>
@@ -1933,29 +1851,29 @@
           <w:szCs w:val="28"/>
           <w:lang w:val="en-US"/>
         </w:rPr>
-        <w:t/>
-      </w:r>
-      <w:r>
-        <w:rPr>
-          <w:rFonts w:ascii="Times New Roman" w:hAnsi="Times New Roman" w:cs="Times New Roman"/>
-          <w:bCs/>
-          <w:i/>
-          <w:iCs/>
-          <w:sz w:val="28"/>
-          <w:szCs w:val="28"/>
-        </w:rPr>
-        <w:t xml:space="preserve"/>
-      </w:r>
-      <w:r>
-        <w:rPr>
-          <w:rFonts w:ascii="Times New Roman" w:hAnsi="Times New Roman" w:cs="Times New Roman"/>
-          <w:bCs/>
-          <w:i/>
-          <w:iCs/>
-          <w:sz w:val="28"/>
-          <w:szCs w:val="28"/>
-        </w:rPr>
-        <w:t/>
+        <w:t>m</w:t>
+      </w:r>
+      <w:r>
+        <w:rPr>
+          <w:rFonts w:ascii="Times New Roman" w:hAnsi="Times New Roman" w:cs="Times New Roman"/>
+          <w:bCs/>
+          <w:i/>
+          <w:iCs/>
+          <w:sz w:val="28"/>
+          <w:szCs w:val="28"/>
+        </w:rPr>
+        <w:t xml:space="preserve"> băng ghim và dụng cụ cắt khâu nối dùng trong phẫu thuật </w:t>
+      </w:r>
+      <w:r>
+        <w:rPr>
+          <w:rFonts w:ascii="Times New Roman" w:hAnsi="Times New Roman" w:cs="Times New Roman"/>
+          <w:bCs/>
+          <w:i/>
+          <w:iCs/>
+          <w:sz w:val="28"/>
+          <w:szCs w:val="28"/>
+        </w:rPr>
+        <w:t>phục vụ công tác chuyên môn tại Bệnh viện đa khoa tỉnh Phú Thọ</w:t>
       </w:r>
       <w:r>
         <w:rPr>
@@ -1967,10 +1885,10 @@
           <w:szCs w:val="28"/>
           <w:lang w:val="pt-BR"/>
         </w:rPr>
-        <w:t/>
+        <w:t>;</w:t>
       </w:r>
     </w:p>
-    <w:p ns2:paraId="77953455" ns2:textId="108082C4">
+    <w:p>
       <w:pPr>
         <w:spacing w:after="0" w:line="312" w:lineRule="auto"/>
         <w:ind w:firstLine="567"/>
@@ -1994,154 +1912,154 @@
           <w:sz w:val="28"/>
           <w:szCs w:val="28"/>
         </w:rPr>
-        <w:t xml:space="preserve">Căn cứ Quyết định số {{SO_QD_DANH_MUC_TCKT}}/QĐ-BV ngày {{NGAY_QD_DANH_MUC_TCKT}} của Giám đốc Bệnh viện đa khoa tỉnh Phú Thọ về việc phê duyệt danh mục, số lượng, tiêu chí kỹ thuật của hạng mục: Mua sắm băng ghim và dụng cụ cắt khâu nối dùng trong phẫu thuật phục vụ công tác chuyên môn tại Bệnh viện đa khoa tỉnh Phú Thọ;</w:t>
-      </w:r>
-      <w:r>
-        <w:rPr>
-          <w:rFonts w:ascii="Times New Roman" w:hAnsi="Times New Roman" w:cs="Times New Roman"/>
-          <w:bCs/>
-          <w:i/>
-          <w:iCs/>
-          <w:sz w:val="28"/>
-          <w:szCs w:val="28"/>
-          <w:lang w:val="en-US"/>
-        </w:rPr>
-        <w:t xml:space="preserve"/>
-      </w:r>
-      <w:r>
-        <w:rPr>
-          <w:rFonts w:ascii="Times New Roman" w:hAnsi="Times New Roman" w:cs="Times New Roman"/>
-          <w:bCs/>
-          <w:i/>
-          <w:iCs/>
-          <w:sz w:val="28"/>
-          <w:szCs w:val="28"/>
-        </w:rPr>
-        <w:t xml:space="preserve"/>
-      </w:r>
-      <w:r>
-        <w:rPr>
-          <w:rFonts w:ascii="Times New Roman" w:hAnsi="Times New Roman" w:cs="Times New Roman"/>
-          <w:bCs/>
-          <w:i/>
-          <w:iCs/>
-          <w:sz w:val="28"/>
-          <w:szCs w:val="28"/>
-          <w:lang w:val="en-US"/>
-        </w:rPr>
-        <w:t/>
-      </w:r>
-      <w:r>
-        <w:rPr>
-          <w:rFonts w:ascii="Times New Roman" w:hAnsi="Times New Roman" w:cs="Times New Roman"/>
-          <w:bCs/>
-          <w:i/>
-          <w:iCs/>
-          <w:sz w:val="28"/>
-          <w:szCs w:val="28"/>
-        </w:rPr>
-        <w:t/>
-      </w:r>
-      <w:r>
-        <w:rPr>
-          <w:rFonts w:ascii="Times New Roman" w:hAnsi="Times New Roman" w:cs="Times New Roman"/>
-          <w:bCs/>
-          <w:i/>
-          <w:iCs/>
-          <w:sz w:val="28"/>
-          <w:szCs w:val="28"/>
-        </w:rPr>
-        <w:t/>
-      </w:r>
-      <w:r>
-        <w:rPr>
-          <w:rFonts w:ascii="Times New Roman" w:hAnsi="Times New Roman" w:cs="Times New Roman"/>
-          <w:bCs/>
-          <w:i/>
-          <w:iCs/>
-          <w:sz w:val="28"/>
-          <w:szCs w:val="28"/>
-        </w:rPr>
-        <w:t xml:space="preserve"/>
-      </w:r>
-      <w:r>
-        <w:rPr>
-          <w:rFonts w:ascii="Times New Roman" w:hAnsi="Times New Roman" w:cs="Times New Roman"/>
-          <w:bCs/>
-          <w:i/>
-          <w:iCs/>
-          <w:sz w:val="28"/>
-          <w:szCs w:val="28"/>
-        </w:rPr>
-        <w:t xml:space="preserve"/>
-      </w:r>
-      <w:r>
-        <w:rPr>
-          <w:rFonts w:ascii="Times New Roman" w:hAnsi="Times New Roman" w:cs="Times New Roman"/>
-          <w:bCs/>
-          <w:i/>
-          <w:iCs/>
-          <w:sz w:val="28"/>
-          <w:szCs w:val="28"/>
-        </w:rPr>
-        <w:t xml:space="preserve"/>
-      </w:r>
-      <w:r>
-        <w:rPr>
-          <w:rFonts w:ascii="Times New Roman" w:hAnsi="Times New Roman" w:cs="Times New Roman"/>
-          <w:bCs/>
-          <w:i/>
-          <w:iCs/>
-          <w:sz w:val="28"/>
-          <w:szCs w:val="28"/>
-          <w:lang w:val="en-US"/>
-        </w:rPr>
-        <w:t/>
-      </w:r>
-      <w:r>
-        <w:rPr>
-          <w:rFonts w:ascii="Times New Roman" w:hAnsi="Times New Roman" w:cs="Times New Roman"/>
-          <w:bCs/>
-          <w:i/>
-          <w:iCs/>
-          <w:sz w:val="28"/>
-          <w:szCs w:val="28"/>
-        </w:rPr>
-        <w:t xml:space="preserve"/>
-      </w:r>
-      <w:r>
-        <w:rPr>
-          <w:rFonts w:ascii="Times New Roman" w:hAnsi="Times New Roman" w:cs="Times New Roman"/>
-          <w:bCs/>
-          <w:i/>
-          <w:iCs/>
-          <w:sz w:val="28"/>
-          <w:szCs w:val="28"/>
-          <w:lang w:val="en-US"/>
-        </w:rPr>
-        <w:t xml:space="preserve"/>
-      </w:r>
-      <w:r>
-        <w:rPr>
-          <w:rFonts w:ascii="Times New Roman" w:hAnsi="Times New Roman" w:cs="Times New Roman"/>
-          <w:bCs/>
-          <w:i/>
-          <w:iCs/>
-          <w:sz w:val="28"/>
-          <w:szCs w:val="28"/>
-        </w:rPr>
-        <w:t xml:space="preserve"/>
-      </w:r>
-      <w:r>
-        <w:rPr>
-          <w:rFonts w:ascii="Times New Roman" w:hAnsi="Times New Roman" w:cs="Times New Roman"/>
-          <w:bCs/>
-          <w:i/>
-          <w:iCs/>
-          <w:sz w:val="28"/>
-          <w:szCs w:val="28"/>
-        </w:rPr>
-        <w:t/>
+        <w:t>Căn cứ Quyết định số</w:t>
+      </w:r>
+      <w:r>
+        <w:rPr>
+          <w:rFonts w:ascii="Times New Roman" w:hAnsi="Times New Roman" w:cs="Times New Roman"/>
+          <w:bCs/>
+          <w:i/>
+          <w:iCs/>
+          <w:sz w:val="28"/>
+          <w:szCs w:val="28"/>
+          <w:lang w:val="en-US"/>
+        </w:rPr>
+        <w:t xml:space="preserve"> 1467</w:t>
+      </w:r>
+      <w:r>
+        <w:rPr>
+          <w:rFonts w:ascii="Times New Roman" w:hAnsi="Times New Roman" w:cs="Times New Roman"/>
+          <w:bCs/>
+          <w:i/>
+          <w:iCs/>
+          <w:sz w:val="28"/>
+          <w:szCs w:val="28"/>
+        </w:rPr>
+        <w:t xml:space="preserve">/QĐ-BV ngày </w:t>
+      </w:r>
+      <w:r>
+        <w:rPr>
+          <w:rFonts w:ascii="Times New Roman" w:hAnsi="Times New Roman" w:cs="Times New Roman"/>
+          <w:bCs/>
+          <w:i/>
+          <w:iCs/>
+          <w:sz w:val="28"/>
+          <w:szCs w:val="28"/>
+          <w:lang w:val="en-US"/>
+        </w:rPr>
+        <w:t>25</w:t>
+      </w:r>
+      <w:r>
+        <w:rPr>
+          <w:rFonts w:ascii="Times New Roman" w:hAnsi="Times New Roman" w:cs="Times New Roman"/>
+          <w:bCs/>
+          <w:i/>
+          <w:iCs/>
+          <w:sz w:val="28"/>
+          <w:szCs w:val="28"/>
+        </w:rPr>
+        <w:t>/03</w:t>
+      </w:r>
+      <w:r>
+        <w:rPr>
+          <w:rFonts w:ascii="Times New Roman" w:hAnsi="Times New Roman" w:cs="Times New Roman"/>
+          <w:bCs/>
+          <w:i/>
+          <w:iCs/>
+          <w:sz w:val="28"/>
+          <w:szCs w:val="28"/>
+        </w:rPr>
+        <w:t>/2026</w:t>
+      </w:r>
+      <w:r>
+        <w:rPr>
+          <w:rFonts w:ascii="Times New Roman" w:hAnsi="Times New Roman" w:cs="Times New Roman"/>
+          <w:bCs/>
+          <w:i/>
+          <w:iCs/>
+          <w:sz w:val="28"/>
+          <w:szCs w:val="28"/>
+        </w:rPr>
+        <w:t xml:space="preserve"> của Giám đốc Bệnh viện đa khoa tỉnh Phú Thọ về việc phê duyệt danh mụ</w:t>
+      </w:r>
+      <w:r>
+        <w:rPr>
+          <w:rFonts w:ascii="Times New Roman" w:hAnsi="Times New Roman" w:cs="Times New Roman"/>
+          <w:bCs/>
+          <w:i/>
+          <w:iCs/>
+          <w:sz w:val="28"/>
+          <w:szCs w:val="28"/>
+        </w:rPr>
+        <w:t xml:space="preserve">c, </w:t>
+      </w:r>
+      <w:r>
+        <w:rPr>
+          <w:rFonts w:ascii="Times New Roman" w:hAnsi="Times New Roman" w:cs="Times New Roman"/>
+          <w:bCs/>
+          <w:i/>
+          <w:iCs/>
+          <w:sz w:val="28"/>
+          <w:szCs w:val="28"/>
+        </w:rPr>
+        <w:t xml:space="preserve">số </w:t>
+      </w:r>
+      <w:r>
+        <w:rPr>
+          <w:rFonts w:ascii="Times New Roman" w:hAnsi="Times New Roman" w:cs="Times New Roman"/>
+          <w:bCs/>
+          <w:i/>
+          <w:iCs/>
+          <w:sz w:val="28"/>
+          <w:szCs w:val="28"/>
+          <w:lang w:val="en-US"/>
+        </w:rPr>
+        <w:t>lượng</w:t>
+      </w:r>
+      <w:r>
+        <w:rPr>
+          <w:rFonts w:ascii="Times New Roman" w:hAnsi="Times New Roman" w:cs="Times New Roman"/>
+          <w:bCs/>
+          <w:i/>
+          <w:iCs/>
+          <w:sz w:val="28"/>
+          <w:szCs w:val="28"/>
+        </w:rPr>
+        <w:t xml:space="preserve">, tiêu chí kỹ thuật </w:t>
+      </w:r>
+      <w:r>
+        <w:rPr>
+          <w:rFonts w:ascii="Times New Roman" w:hAnsi="Times New Roman" w:cs="Times New Roman"/>
+          <w:bCs/>
+          <w:i/>
+          <w:iCs/>
+          <w:sz w:val="28"/>
+          <w:szCs w:val="28"/>
+          <w:lang w:val="en-US"/>
+        </w:rPr>
+        <w:t xml:space="preserve">của </w:t>
+      </w:r>
+      <w:r>
+        <w:rPr>
+          <w:rFonts w:ascii="Times New Roman" w:hAnsi="Times New Roman" w:cs="Times New Roman"/>
+          <w:bCs/>
+          <w:i/>
+          <w:iCs/>
+          <w:sz w:val="28"/>
+          <w:szCs w:val="28"/>
+        </w:rPr>
+        <w:t xml:space="preserve">hạng mục: </w:t>
+      </w:r>
+      <w:r>
+        <w:rPr>
+          <w:rFonts w:ascii="Times New Roman" w:hAnsi="Times New Roman" w:cs="Times New Roman"/>
+          <w:bCs/>
+          <w:i/>
+          <w:iCs/>
+          <w:sz w:val="28"/>
+          <w:szCs w:val="28"/>
+        </w:rPr>
+        <w:t>M</w:t>
       </w:r>
       <w:r>
         <w:rPr>
@@ -2152,7 +2070,7 @@
           <w:sz w:val="28"/>
           <w:szCs w:val="28"/>
         </w:rPr>
-        <w:t/>
+        <w:t>ua sắ</w:t>
       </w:r>
       <w:r>
         <w:rPr>
@@ -2164,29 +2082,29 @@
           <w:szCs w:val="28"/>
           <w:lang w:val="en-US"/>
         </w:rPr>
-        <w:t/>
-      </w:r>
-      <w:r>
-        <w:rPr>
-          <w:rFonts w:ascii="Times New Roman" w:hAnsi="Times New Roman" w:cs="Times New Roman"/>
-          <w:bCs/>
-          <w:i/>
-          <w:iCs/>
-          <w:sz w:val="28"/>
-          <w:szCs w:val="28"/>
-        </w:rPr>
-        <w:t xml:space="preserve"/>
-      </w:r>
-      <w:r>
-        <w:rPr>
-          <w:rFonts w:ascii="Times New Roman" w:hAnsi="Times New Roman" w:cs="Times New Roman"/>
-          <w:bCs/>
-          <w:i/>
-          <w:iCs/>
-          <w:sz w:val="28"/>
-          <w:szCs w:val="28"/>
-        </w:rPr>
-        <w:t/>
+        <w:t>m</w:t>
+      </w:r>
+      <w:r>
+        <w:rPr>
+          <w:rFonts w:ascii="Times New Roman" w:hAnsi="Times New Roman" w:cs="Times New Roman"/>
+          <w:bCs/>
+          <w:i/>
+          <w:iCs/>
+          <w:sz w:val="28"/>
+          <w:szCs w:val="28"/>
+        </w:rPr>
+        <w:t xml:space="preserve"> băng ghim và dụng cụ cắt khâu nối dùng trong phẫu thuật </w:t>
+      </w:r>
+      <w:r>
+        <w:rPr>
+          <w:rFonts w:ascii="Times New Roman" w:hAnsi="Times New Roman" w:cs="Times New Roman"/>
+          <w:bCs/>
+          <w:i/>
+          <w:iCs/>
+          <w:sz w:val="28"/>
+          <w:szCs w:val="28"/>
+        </w:rPr>
+        <w:t>phục vụ công tác chuyên môn tại Bệnh viện đa khoa tỉnh Phú Thọ</w:t>
       </w:r>
       <w:r>
         <w:rPr>
@@ -2198,10 +2116,10 @@
           <w:szCs w:val="28"/>
           <w:lang w:val="sv-SE"/>
         </w:rPr>
-        <w:t/>
+        <w:t>;</w:t>
       </w:r>
     </w:p>
-    <w:p ns2:paraId="1D72D00B" ns2:textId="2E7D29A7">
+    <w:p>
       <w:pPr>
         <w:spacing w:after="0" w:line="312" w:lineRule="auto"/>
         <w:ind w:firstLine="567"/>
@@ -2225,7 +2143,7 @@
           <w:szCs w:val="28"/>
           <w:lang w:val="pt-BR"/>
         </w:rPr>
-        <w:t xml:space="preserve">Căn cứ Biên bản họp ngày {{NGAY_BB_TCG_DU_TOAN_KHLCNT}} của Tổ chuyên gia đấu thầu về việc thống nhất các nội dung liên quan đến kế hoạch lựa chọn nhà thầu dự toán mua sắm: Mua sắm băng ghim và dụng cụ cắt khâu nối dùng trong phẫu thuật phục vụ công tác chuyên môn tại Bệnh viện đa khoa tỉnh Phú Thọ;</w:t>
+        <w:t xml:space="preserve">Căn cứ Biên bản họp </w:t>
       </w:r>
       <w:r>
         <w:rPr>
@@ -2236,7 +2154,7 @@
           <w:szCs w:val="28"/>
           <w:lang w:val="pt-BR"/>
         </w:rPr>
-        <w:t xml:space="preserve"/>
+        <w:t xml:space="preserve">ngày </w:t>
       </w:r>
       <w:r>
         <w:rPr>
@@ -2246,7 +2164,7 @@
           <w:sz w:val="28"/>
           <w:szCs w:val="28"/>
         </w:rPr>
-        <w:t/>
+        <w:t>14</w:t>
       </w:r>
       <w:r>
         <w:rPr>
@@ -2257,7 +2175,7 @@
           <w:szCs w:val="28"/>
           <w:lang w:val="pt-BR"/>
         </w:rPr>
-        <w:t/>
+        <w:t>/</w:t>
       </w:r>
       <w:r>
         <w:rPr>
@@ -2268,7 +2186,7 @@
           <w:szCs w:val="28"/>
           <w:lang w:val="pt-BR"/>
         </w:rPr>
-        <w:t/>
+        <w:t>04</w:t>
       </w:r>
       <w:r>
         <w:rPr>
@@ -2279,7 +2197,7 @@
           <w:szCs w:val="28"/>
           <w:lang w:val="pt-BR"/>
         </w:rPr>
-        <w:t/>
+        <w:t>/2026</w:t>
       </w:r>
       <w:r>
         <w:rPr>
@@ -2290,7 +2208,7 @@
           <w:szCs w:val="28"/>
           <w:lang w:val="pt-BR"/>
         </w:rPr>
-        <w:t xml:space="preserve"/>
+        <w:t xml:space="preserve"> của Tổ chuyên gia đấu thầu </w:t>
       </w:r>
       <w:r>
         <w:rPr>
@@ -2301,7 +2219,7 @@
           <w:szCs w:val="28"/>
           <w:lang w:val="pt-BR"/>
         </w:rPr>
-        <w:t/>
+        <w:t>về việc</w:t>
       </w:r>
       <w:r>
         <w:rPr>
@@ -2312,7 +2230,7 @@
           <w:szCs w:val="28"/>
           <w:lang w:val="pt-BR"/>
         </w:rPr>
-        <w:t xml:space="preserve"/>
+        <w:t xml:space="preserve"> </w:t>
       </w:r>
       <w:r>
         <w:rPr>
@@ -2321,7 +2239,7 @@
           <w:sz w:val="28"/>
           <w:szCs w:val="28"/>
         </w:rPr>
-        <w:t xml:space="preserve"/>
+        <w:t xml:space="preserve">thống nhất </w:t>
       </w:r>
       <w:r>
         <w:rPr>
@@ -2331,7 +2249,7 @@
           <w:sz w:val="28"/>
           <w:szCs w:val="28"/>
         </w:rPr>
-        <w:t/>
+        <w:t>các nội dung liên quan đến</w:t>
       </w:r>
       <w:r>
         <w:rPr>
@@ -2342,7 +2260,7 @@
           <w:szCs w:val="28"/>
           <w:lang w:val="en-US"/>
         </w:rPr>
-        <w:t xml:space="preserve"/>
+        <w:t xml:space="preserve"> </w:t>
       </w:r>
       <w:r>
         <w:rPr>
@@ -2352,7 +2270,7 @@
           <w:sz w:val="28"/>
           <w:szCs w:val="28"/>
         </w:rPr>
-        <w:t/>
+        <w:t>kế hoạch lựa chọn nhà thầu</w:t>
       </w:r>
       <w:r>
         <w:rPr>
@@ -2363,7 +2281,7 @@
           <w:szCs w:val="28"/>
           <w:lang w:val="en-US"/>
         </w:rPr>
-        <w:t xml:space="preserve"/>
+        <w:t xml:space="preserve"> dự toán mua sắm</w:t>
       </w:r>
       <w:r>
         <w:rPr>
@@ -2374,18 +2292,18 @@
           <w:szCs w:val="28"/>
           <w:lang w:val="en-US"/>
         </w:rPr>
-        <w:t xml:space="preserve"/>
-      </w:r>
-      <w:r>
-        <w:rPr>
-          <w:rFonts w:ascii="Times New Roman" w:hAnsi="Times New Roman" w:cs="Times New Roman"/>
-          <w:bCs/>
-          <w:i/>
-          <w:iCs/>
-          <w:sz w:val="28"/>
-          <w:szCs w:val="28"/>
-        </w:rPr>
-        <w:t/>
+        <w:t xml:space="preserve">: </w:t>
+      </w:r>
+      <w:r>
+        <w:rPr>
+          <w:rFonts w:ascii="Times New Roman" w:hAnsi="Times New Roman" w:cs="Times New Roman"/>
+          <w:bCs/>
+          <w:i/>
+          <w:iCs/>
+          <w:sz w:val="28"/>
+          <w:szCs w:val="28"/>
+        </w:rPr>
+        <w:t>M</w:t>
       </w:r>
       <w:r>
         <w:rPr>
@@ -2396,7 +2314,7 @@
           <w:sz w:val="28"/>
           <w:szCs w:val="28"/>
         </w:rPr>
-        <w:t/>
+        <w:t>ua sắ</w:t>
       </w:r>
       <w:r>
         <w:rPr>
@@ -2408,43 +2326,43 @@
           <w:szCs w:val="28"/>
           <w:lang w:val="en-US"/>
         </w:rPr>
-        <w:t/>
-      </w:r>
-      <w:r>
-        <w:rPr>
-          <w:rFonts w:ascii="Times New Roman" w:hAnsi="Times New Roman" w:cs="Times New Roman"/>
-          <w:bCs/>
-          <w:i/>
-          <w:iCs/>
-          <w:sz w:val="28"/>
-          <w:szCs w:val="28"/>
-        </w:rPr>
-        <w:t xml:space="preserve"/>
-      </w:r>
-      <w:r>
-        <w:rPr>
-          <w:rFonts w:ascii="Times New Roman" w:hAnsi="Times New Roman" w:cs="Times New Roman"/>
-          <w:bCs/>
-          <w:i/>
-          <w:iCs/>
-          <w:sz w:val="28"/>
-          <w:szCs w:val="28"/>
-        </w:rPr>
-        <w:t/>
-      </w:r>
-      <w:r>
-        <w:rPr>
-          <w:rFonts w:ascii="Times New Roman" w:hAnsi="Times New Roman" w:cs="Times New Roman"/>
-          <w:bCs/>
-          <w:i/>
-          <w:iCs/>
-          <w:sz w:val="28"/>
-          <w:szCs w:val="28"/>
-        </w:rPr>
-        <w:t/>
+        <w:t>m</w:t>
+      </w:r>
+      <w:r>
+        <w:rPr>
+          <w:rFonts w:ascii="Times New Roman" w:hAnsi="Times New Roman" w:cs="Times New Roman"/>
+          <w:bCs/>
+          <w:i/>
+          <w:iCs/>
+          <w:sz w:val="28"/>
+          <w:szCs w:val="28"/>
+        </w:rPr>
+        <w:t xml:space="preserve"> băng ghim và dụng cụ cắt khâu nối dùng trong phẫu thuật </w:t>
+      </w:r>
+      <w:r>
+        <w:rPr>
+          <w:rFonts w:ascii="Times New Roman" w:hAnsi="Times New Roman" w:cs="Times New Roman"/>
+          <w:bCs/>
+          <w:i/>
+          <w:iCs/>
+          <w:sz w:val="28"/>
+          <w:szCs w:val="28"/>
+        </w:rPr>
+        <w:t>phục vụ công tác chuyên môn tại Bệnh viện đa khoa tỉnh Phú Thọ</w:t>
+      </w:r>
+      <w:r>
+        <w:rPr>
+          <w:rFonts w:ascii="Times New Roman" w:hAnsi="Times New Roman" w:cs="Times New Roman"/>
+          <w:bCs/>
+          <w:i/>
+          <w:iCs/>
+          <w:sz w:val="28"/>
+          <w:szCs w:val="28"/>
+        </w:rPr>
+        <w:t>;</w:t>
       </w:r>
     </w:p>
-    <w:p ns2:paraId="21B495B6" ns2:textId="58A3F3F6">
+    <w:p>
       <w:pPr>
         <w:spacing w:after="0" w:line="312" w:lineRule="auto"/>
         <w:ind w:right="-142" w:firstLine="567"/>
@@ -2496,7 +2414,7 @@
         <w:t>.</w:t>
       </w:r>
     </w:p>
-    <w:p ns2:paraId="1B3BCFA3" ns2:textId="77777777">
+    <w:p>
       <w:pPr>
         <w:spacing w:after="0" w:line="312" w:lineRule="auto"/>
         <w:jc w:val="center"/>
@@ -2510,7 +2428,7 @@
         </w:rPr>
       </w:pPr>
     </w:p>
-    <w:p ns2:paraId="2010FE3F" ns2:textId="0850B4FC">
+    <w:p>
       <w:pPr>
         <w:spacing w:after="0" w:line="312" w:lineRule="auto"/>
         <w:jc w:val="center"/>
@@ -2547,7 +2465,7 @@
         <w:t>NH</w:t>
       </w:r>
     </w:p>
-    <w:p ns2:paraId="43B99B27" ns2:textId="34923229">
+    <w:p>
       <w:pPr>
         <w:spacing w:after="0" w:line="312" w:lineRule="auto"/>
         <w:ind w:right="-142" w:firstLine="567"/>
@@ -2660,7 +2578,7 @@
         <w:t>:</w:t>
       </w:r>
     </w:p>
-    <w:p ns2:paraId="4281EF06" ns2:textId="0D658E4F">
+    <w:p>
       <w:pPr>
         <w:spacing w:after="0" w:line="312" w:lineRule="auto"/>
         <w:ind w:firstLine="567"/>
@@ -2741,7 +2659,7 @@
         <w:t>: Bệnh viện đa khoa tỉnh Phú Thọ.</w:t>
       </w:r>
     </w:p>
-    <w:p ns2:paraId="0DBB9A71" ns2:textId="5E914967">
+    <w:p>
       <w:pPr>
         <w:tabs>
           <w:tab w:val="left" w:pos="851"/>
@@ -2882,7 +2800,7 @@
         <w:t>kèm.</w:t>
       </w:r>
     </w:p>
-    <w:p ns2:paraId="43016098" ns2:textId="38980BF0">
+    <w:p>
       <w:pPr>
         <w:spacing w:after="0" w:line="312" w:lineRule="auto"/>
         <w:ind w:firstLine="567"/>
@@ -2902,25 +2820,25 @@
           <w:szCs w:val="28"/>
           <w:lang w:val="en-US"/>
         </w:rPr>
-        <w:t xml:space="preserve">3. Dự toán kinh phí thực hiện: {{TONG_MUC_DU_TOAN}} VNĐ (Bằng chữ: {{TONG_MUC_DU_TOAN_CHU}}./.).</w:t>
-      </w:r>
-      <w:r>
-        <w:rPr>
-          <w:rFonts w:ascii="Times New Roman" w:hAnsi="Times New Roman" w:cs="Times New Roman"/>
-          <w:sz w:val="28"/>
-          <w:szCs w:val="28"/>
-          <w:lang w:val="en-US"/>
-        </w:rPr>
-        <w:t/>
-      </w:r>
-      <w:r>
-        <w:rPr>
-          <w:rFonts w:ascii="Times New Roman" w:hAnsi="Times New Roman" w:cs="Times New Roman"/>
-          <w:sz w:val="28"/>
-          <w:szCs w:val="28"/>
-          <w:lang w:val="en-US"/>
-        </w:rPr>
-        <w:t xml:space="preserve"/>
+        <w:t>3. Dự toán kinh phí thực hiện</w:t>
+      </w:r>
+      <w:r>
+        <w:rPr>
+          <w:rFonts w:ascii="Times New Roman" w:hAnsi="Times New Roman" w:cs="Times New Roman"/>
+          <w:sz w:val="28"/>
+          <w:szCs w:val="28"/>
+          <w:lang w:val="en-US"/>
+        </w:rPr>
+        <w:t>:</w:t>
+      </w:r>
+      <w:r>
+        <w:rPr>
+          <w:rFonts w:ascii="Times New Roman" w:hAnsi="Times New Roman" w:cs="Times New Roman"/>
+          <w:sz w:val="28"/>
+          <w:szCs w:val="28"/>
+          <w:lang w:val="en-US"/>
+        </w:rPr>
+        <w:t xml:space="preserve"> </w:t>
       </w:r>
       <w:r>
         <w:rPr>
@@ -2929,7 +2847,7 @@
           <w:sz w:val="28"/>
           <w:szCs w:val="28"/>
         </w:rPr>
-        <w:t/>
+        <w:t>1.999.950.000</w:t>
       </w:r>
       <w:r>
         <w:rPr>
@@ -2938,7 +2856,7 @@
           <w:sz w:val="28"/>
           <w:szCs w:val="28"/>
         </w:rPr>
-        <w:t xml:space="preserve"/>
+        <w:t xml:space="preserve"> </w:t>
       </w:r>
       <w:r>
         <w:rPr>
@@ -2948,7 +2866,7 @@
           <w:szCs w:val="28"/>
           <w:lang w:val="es-ES"/>
         </w:rPr>
-        <w:t/>
+        <w:t>VN</w:t>
       </w:r>
       <w:r>
         <w:rPr>
@@ -2957,7 +2875,7 @@
           <w:sz w:val="28"/>
           <w:szCs w:val="28"/>
         </w:rPr>
-        <w:t/>
+        <w:t>Đ</w:t>
       </w:r>
       <w:r>
         <w:rPr>
@@ -2967,7 +2885,7 @@
           <w:szCs w:val="28"/>
           <w:lang w:val="es-ES"/>
         </w:rPr>
-        <w:t xml:space="preserve"/>
+        <w:t xml:space="preserve"> (Bằng chữ:</w:t>
       </w:r>
       <w:r>
         <w:rPr>
@@ -2977,7 +2895,7 @@
           <w:szCs w:val="28"/>
           <w:lang w:val="es-ES"/>
         </w:rPr>
-        <w:t xml:space="preserve"/>
+        <w:t xml:space="preserve"> </w:t>
       </w:r>
       <w:r>
         <w:rPr>
@@ -2986,7 +2904,7 @@
           <w:sz w:val="28"/>
           <w:szCs w:val="28"/>
         </w:rPr>
-        <w:t xml:space="preserve"/>
+        <w:t xml:space="preserve">Một tỷ chín trăm </w:t>
       </w:r>
       <w:r>
         <w:rPr>
@@ -2995,7 +2913,7 @@
           <w:sz w:val="28"/>
           <w:szCs w:val="28"/>
         </w:rPr>
-        <w:t/>
+        <w:t>chín mươi chín triệu chín trăm năm mươi nghìn đồng</w:t>
       </w:r>
       <w:r>
         <w:rPr>
@@ -3005,10 +2923,10 @@
           <w:szCs w:val="28"/>
           <w:lang w:val="es-ES"/>
         </w:rPr>
-        <w:t/>
+        <w:t>./.).</w:t>
       </w:r>
     </w:p>
-    <w:p ns2:paraId="662F4AF8" ns2:textId="26E37AB1">
+    <w:p>
       <w:pPr>
         <w:spacing w:after="0" w:line="312" w:lineRule="auto"/>
         <w:ind w:firstLine="567"/>
@@ -3040,7 +2958,7 @@
         <w:t xml:space="preserve">  </w:t>
       </w:r>
     </w:p>
-    <w:p ns2:paraId="69CFC80F" ns2:textId="77777777">
+    <w:p>
       <w:pPr>
         <w:spacing w:after="0" w:line="312" w:lineRule="auto"/>
         <w:ind w:firstLine="567"/>
@@ -3088,7 +3006,7 @@
           <w:sz w:val="28"/>
           <w:szCs w:val="28"/>
         </w:rPr>
-        <w:t xml:space="preserve">{{TONG_MUC_DU_TOAN}} </w:t>
+        <w:t xml:space="preserve">1.999.950.000 </w:t>
       </w:r>
       <w:r>
         <w:rPr>
@@ -3136,7 +3054,7 @@
           <w:sz w:val="28"/>
           <w:szCs w:val="28"/>
         </w:rPr>
-        <w:t>{{TONG_MUC_DU_TOAN_CHU}}</w:t>
+        <w:t>Một tỷ chín trăm chín mươi chín triệu chín trăm năm mươi nghìn đồng</w:t>
       </w:r>
       <w:r>
         <w:rPr>
@@ -3149,7 +3067,7 @@
         <w:t>./.).</w:t>
       </w:r>
     </w:p>
-    <w:p ns2:paraId="555506C5" ns2:textId="3ACA5DFB">
+    <w:p>
       <w:pPr>
         <w:spacing w:after="0" w:line="312" w:lineRule="auto"/>
         <w:ind w:firstLine="567"/>
@@ -3222,7 +3140,7 @@
         <w:tab/>
       </w:r>
     </w:p>
-    <w:p ns2:paraId="39F1A250" ns2:textId="23A08D67">
+    <w:p>
       <w:pPr>
         <w:spacing w:after="0" w:line="312" w:lineRule="auto"/>
         <w:ind w:firstLine="567"/>
@@ -3284,7 +3202,7 @@
         <w:t>Tổ chức thực hiện.</w:t>
       </w:r>
     </w:p>
-    <w:p ns2:paraId="05EC9C60" ns2:textId="297E00BB">
+    <w:p>
       <w:pPr>
         <w:spacing w:after="0" w:line="312" w:lineRule="auto"/>
         <w:ind w:firstLine="567"/>
@@ -3496,7 +3414,7 @@
         <w:t xml:space="preserve"> căn cứ quyết định này triển khai các công việc tiếp theo để thực hiện dự toán mua sắm theo đúng các quy định hiện hành của pháp luật.</w:t>
       </w:r>
     </w:p>
-    <w:p ns2:paraId="3341A734" ns2:textId="615D6808">
+    <w:p>
       <w:pPr>
         <w:spacing w:after="0" w:line="312" w:lineRule="auto"/>
         <w:ind w:firstLine="567"/>
@@ -3759,7 +3677,7 @@
         <w:t>./.</w:t>
       </w:r>
     </w:p>
-    <w:p ns2:paraId="576CDCE9" ns2:textId="77777777">
+    <w:p>
       <w:pPr>
         <w:spacing w:after="0" w:line="312" w:lineRule="auto"/>
         <w:ind w:firstLine="567"/>
@@ -3773,7 +3691,7 @@
         </w:rPr>
       </w:pPr>
     </w:p>
-    <w:p ns2:paraId="78B8508D" ns2:textId="77777777">
+    <w:p>
       <w:pPr>
         <w:tabs>
           <w:tab w:val="left" w:pos="0"/>
@@ -3790,7 +3708,7 @@
         </w:rPr>
       </w:pPr>
     </w:p>
-    <w:p ns2:paraId="51F7292F" ns2:textId="77777777">
+    <w:p>
       <w:pPr>
         <w:spacing w:before="120" w:after="120"/>
         <w:jc w:val="both"/>
@@ -3821,7 +3739,7 @@
         <w:gridCol w:w="4644"/>
         <w:gridCol w:w="3730"/>
       </w:tblGrid>
-      <w:tr ns2:paraId="5049A676" ns2:textId="77777777">
+      <w:tr>
         <w:tc>
           <w:tcPr>
             <w:tcW w:w="4644" w:type="dxa"/>
@@ -3841,7 +3759,7 @@
               <w:right w:w="108" w:type="dxa"/>
             </w:tcMar>
           </w:tcPr>
-          <w:p ns2:paraId="11F3C293" ns2:textId="77777777">
+          <w:p>
             <w:pPr>
               <w:tabs>
                 <w:tab w:val="left" w:pos="939"/>
@@ -3885,7 +3803,7 @@
               <w:t>n:</w:t>
             </w:r>
           </w:p>
-          <w:p ns2:paraId="4F7C345A" ns2:textId="77777777">
+          <w:p>
             <w:pPr>
               <w:tabs>
                 <w:tab w:val="left" w:pos="939"/>
@@ -3959,7 +3877,7 @@
               <w:t xml:space="preserve"> (để biết);</w:t>
             </w:r>
           </w:p>
-          <w:p ns2:paraId="4656494D" ns2:textId="1D94CA16">
+          <w:p>
             <w:pPr>
               <w:spacing w:after="0"/>
               <w:rPr>
@@ -4112,7 +4030,7 @@
               <w:right w:w="108" w:type="dxa"/>
             </w:tcMar>
           </w:tcPr>
-          <w:p ns2:paraId="7746DAB9" ns2:textId="77777777">
+          <w:p>
             <w:pPr>
               <w:spacing w:after="120"/>
               <w:jc w:val="center"/>
@@ -4172,7 +4090,7 @@
               <w:t>GIÁM ĐỐC</w:t>
             </w:r>
           </w:p>
-          <w:p ns2:paraId="7441DD8B" ns2:textId="77777777">
+          <w:p>
             <w:pPr>
               <w:spacing w:after="120"/>
               <w:jc w:val="center"/>
@@ -4184,7 +4102,7 @@
               </w:rPr>
             </w:pPr>
           </w:p>
-          <w:p ns2:paraId="47DD215C" ns2:textId="77777777">
+          <w:p>
             <w:pPr>
               <w:rPr>
                 <w:rFonts w:ascii="Times New Roman" w:hAnsi="Times New Roman" w:cs="Times New Roman"/>
@@ -4197,7 +4115,7 @@
               </w:rPr>
             </w:pPr>
           </w:p>
-          <w:p ns2:paraId="09559ACB" ns2:textId="77777777">
+          <w:p>
             <w:pPr>
               <w:jc w:val="center"/>
               <w:rPr>
@@ -4211,7 +4129,7 @@
               </w:rPr>
             </w:pPr>
           </w:p>
-          <w:p ns2:paraId="34202574" ns2:textId="77777777">
+          <w:p>
             <w:pPr>
               <w:jc w:val="center"/>
               <w:rPr>
@@ -4243,13 +4161,13 @@
                 <w:szCs w:val="28"/>
                 <w:lang w:val="en-US"/>
               </w:rPr>
-              <w:t>{{GIAM_DOC_KY}}</w:t>
+              <w:t>Lê Đình Thanh Sơn</w:t>
             </w:r>
           </w:p>
         </w:tc>
       </w:tr>
     </w:tbl>
-    <w:p ns2:paraId="40B9B076" ns2:textId="77777777">
+    <w:p>
       <w:pPr>
         <w:tabs>
           <w:tab w:val="left" w:pos="1056"/>
@@ -4264,8 +4182,8 @@
           <w:lang w:val="en-US"/>
         </w:rPr>
         <w:sectPr>
-          <w:headerReference w:type="default" ns10:id="rId8"/>
-          <w:footerReference w:type="default" ns10:id="rId9"/>
+          <w:headerReference w:type="default" r:id="rId8"/>
+          <w:footerReference w:type="default" r:id="rId9"/>
           <w:type w:val="nextColumn"/>
           <w:pgSz w:w="11906" w:h="16838" w:code="9"/>
           <w:pgMar w:top="993" w:right="1134" w:bottom="1134" w:left="1701" w:header="720" w:footer="720" w:gutter="0"/>
@@ -4275,7 +4193,7 @@
         </w:sectPr>
       </w:pPr>
     </w:p>
-    <w:p ns2:paraId="2EB372DD" ns2:textId="77777777">
+    <w:p>
       <w:pPr>
         <w:tabs>
           <w:tab w:val="left" w:pos="540"/>
@@ -4302,7 +4220,7 @@
         <w:t>PHỤ LỤC</w:t>
       </w:r>
     </w:p>
-    <w:p ns2:paraId="354A5384" ns2:textId="37ECF5EA">
+    <w:p>
       <w:pPr>
         <w:tabs>
           <w:tab w:val="left" w:pos="1056"/>
@@ -4389,7 +4307,7 @@
         <w:t>mua sắm</w:t>
       </w:r>
     </w:p>
-    <w:p ns2:paraId="7F72B083" ns2:textId="112D45F9">
+    <w:p>
       <w:pPr>
         <w:tabs>
           <w:tab w:val="left" w:pos="1056"/>
@@ -4412,77 +4330,77 @@
           <w:szCs w:val="28"/>
           <w:lang w:val="en-US"/>
         </w:rPr>
-        <w:t xml:space="preserve">(Kèm theo quyết định số       /QĐ-BV ngày {{NGAY_QD_NHIEM_VU_DU_TOAN}} của Giám đốc Bệnh viện đa khoa tỉnh Phú Thọ)</w:t>
-      </w:r>
-      <w:r>
-        <w:rPr>
-          <w:rFonts w:ascii="Times New Roman" w:hAnsi="Times New Roman" w:cs="Times New Roman"/>
-          <w:i/>
-          <w:sz w:val="28"/>
-          <w:szCs w:val="28"/>
-          <w:lang w:val="en-US"/>
-        </w:rPr>
-        <w:t/>
-      </w:r>
-      <w:r>
-        <w:rPr>
-          <w:rFonts w:ascii="Times New Roman" w:hAnsi="Times New Roman" w:cs="Times New Roman"/>
-          <w:i/>
-          <w:sz w:val="28"/>
-          <w:szCs w:val="28"/>
-          <w:lang w:val="en-US"/>
-        </w:rPr>
-        <w:t xml:space="preserve"/>
-      </w:r>
-      <w:r>
-        <w:rPr>
-          <w:rFonts w:ascii="Times New Roman" w:hAnsi="Times New Roman" w:cs="Times New Roman"/>
-          <w:i/>
-          <w:sz w:val="28"/>
-          <w:szCs w:val="28"/>
-          <w:lang w:val="en-US"/>
-        </w:rPr>
-        <w:t/>
-      </w:r>
-      <w:r>
-        <w:rPr>
-          <w:rFonts w:ascii="Times New Roman" w:hAnsi="Times New Roman" w:cs="Times New Roman"/>
-          <w:i/>
-          <w:sz w:val="28"/>
-          <w:szCs w:val="28"/>
-          <w:lang w:val="en-US"/>
-        </w:rPr>
-        <w:t/>
-      </w:r>
-      <w:r>
-        <w:rPr>
-          <w:rFonts w:ascii="Times New Roman" w:hAnsi="Times New Roman" w:cs="Times New Roman"/>
-          <w:i/>
-          <w:sz w:val="28"/>
-          <w:szCs w:val="28"/>
-          <w:lang w:val="en-US"/>
-        </w:rPr>
-        <w:t/>
-      </w:r>
-      <w:r>
-        <w:rPr>
-          <w:rFonts w:ascii="Times New Roman" w:hAnsi="Times New Roman" w:cs="Times New Roman"/>
-          <w:i/>
-          <w:sz w:val="28"/>
-          <w:szCs w:val="28"/>
-          <w:lang w:val="en-US"/>
-        </w:rPr>
-        <w:t/>
-      </w:r>
-      <w:r>
-        <w:rPr>
-          <w:rFonts w:ascii="Times New Roman" w:hAnsi="Times New Roman" w:cs="Times New Roman"/>
-          <w:i/>
-          <w:sz w:val="28"/>
-          <w:szCs w:val="28"/>
-          <w:lang w:val="en-US"/>
-        </w:rPr>
-        <w:t xml:space="preserve"/>
+        <w:t xml:space="preserve">(Kèm theo quyết định số       </w:t>
+      </w:r>
+      <w:r>
+        <w:rPr>
+          <w:rFonts w:ascii="Times New Roman" w:hAnsi="Times New Roman" w:cs="Times New Roman"/>
+          <w:i/>
+          <w:sz w:val="28"/>
+          <w:szCs w:val="28"/>
+          <w:lang w:val="en-US"/>
+        </w:rPr>
+        <w:t>/</w:t>
+      </w:r>
+      <w:r>
+        <w:rPr>
+          <w:rFonts w:ascii="Times New Roman" w:hAnsi="Times New Roman" w:cs="Times New Roman"/>
+          <w:i/>
+          <w:sz w:val="28"/>
+          <w:szCs w:val="28"/>
+          <w:lang w:val="en-US"/>
+        </w:rPr>
+        <w:t xml:space="preserve">QĐ-BV ngày </w:t>
+      </w:r>
+      <w:r>
+        <w:rPr>
+          <w:rFonts w:ascii="Times New Roman" w:hAnsi="Times New Roman" w:cs="Times New Roman"/>
+          <w:i/>
+          <w:sz w:val="28"/>
+          <w:szCs w:val="28"/>
+          <w:lang w:val="en-US"/>
+        </w:rPr>
+        <w:t>23</w:t>
+      </w:r>
+      <w:r>
+        <w:rPr>
+          <w:rFonts w:ascii="Times New Roman" w:hAnsi="Times New Roman" w:cs="Times New Roman"/>
+          <w:i/>
+          <w:sz w:val="28"/>
+          <w:szCs w:val="28"/>
+          <w:lang w:val="en-US"/>
+        </w:rPr>
+        <w:t>/</w:t>
+      </w:r>
+      <w:r>
+        <w:rPr>
+          <w:rFonts w:ascii="Times New Roman" w:hAnsi="Times New Roman" w:cs="Times New Roman"/>
+          <w:i/>
+          <w:sz w:val="28"/>
+          <w:szCs w:val="28"/>
+          <w:lang w:val="en-US"/>
+        </w:rPr>
+        <w:t>4</w:t>
+      </w:r>
+      <w:r>
+        <w:rPr>
+          <w:rFonts w:ascii="Times New Roman" w:hAnsi="Times New Roman" w:cs="Times New Roman"/>
+          <w:i/>
+          <w:sz w:val="28"/>
+          <w:szCs w:val="28"/>
+          <w:lang w:val="en-US"/>
+        </w:rPr>
+        <w:t>/2026</w:t>
+      </w:r>
+      <w:r>
+        <w:rPr>
+          <w:rFonts w:ascii="Times New Roman" w:hAnsi="Times New Roman" w:cs="Times New Roman"/>
+          <w:i/>
+          <w:sz w:val="28"/>
+          <w:szCs w:val="28"/>
+          <w:lang w:val="en-US"/>
+        </w:rPr>
+        <w:t xml:space="preserve"> của Giám đốc Bệnh viện đa khoa tỉnh Phú Thọ)</w:t>
       </w:r>
     </w:p>
     <w:tbl>
@@ -4510,7 +4428,7 @@
         <w:gridCol w:w="1559"/>
         <w:gridCol w:w="1756"/>
       </w:tblGrid>
-      <w:tr ns2:paraId="5D3005C1" ns2:textId="31C67AE0">
+      <w:tr>
         <w:trPr>
           <w:trHeight w:val="645"/>
           <w:tblHeader/>
@@ -4527,7 +4445,7 @@
             </w:tcBorders>
             <w:vAlign w:val="center"/>
           </w:tcPr>
-          <w:p ns2:paraId="51F12BB8" ns2:textId="77777777">
+          <w:p>
             <w:pPr>
               <w:spacing w:after="0" w:line="271" w:lineRule="auto"/>
               <w:jc w:val="center"/>
@@ -4561,7 +4479,7 @@
             </w:tcBorders>
             <w:vAlign w:val="center"/>
           </w:tcPr>
-          <w:p ns2:paraId="2C270098" ns2:textId="3D71C778">
+          <w:p>
             <w:pPr>
               <w:spacing w:after="0" w:line="271" w:lineRule="auto"/>
               <w:jc w:val="center"/>
@@ -4594,7 +4512,7 @@
             </w:tcBorders>
             <w:vAlign w:val="center"/>
           </w:tcPr>
-          <w:p ns2:paraId="6F4E9D62" ns2:textId="77777777">
+          <w:p>
             <w:pPr>
               <w:spacing w:after="0" w:line="271" w:lineRule="auto"/>
               <w:jc w:val="center"/>
@@ -4627,7 +4545,7 @@
             </w:tcBorders>
             <w:vAlign w:val="center"/>
           </w:tcPr>
-          <w:p ns2:paraId="35F8B475" ns2:textId="77777777">
+          <w:p>
             <w:pPr>
               <w:spacing w:after="0" w:line="271" w:lineRule="auto"/>
               <w:jc w:val="center"/>
@@ -4660,7 +4578,7 @@
             </w:tcBorders>
             <w:vAlign w:val="center"/>
           </w:tcPr>
-          <w:p ns2:paraId="212FD016" ns2:textId="77777777">
+          <w:p>
             <w:pPr>
               <w:spacing w:after="0" w:line="271" w:lineRule="auto"/>
               <w:jc w:val="center"/>
@@ -4693,7 +4611,7 @@
             </w:tcBorders>
             <w:vAlign w:val="center"/>
           </w:tcPr>
-          <w:p ns2:paraId="424E9ED4" ns2:textId="77777777">
+          <w:p>
             <w:pPr>
               <w:spacing w:after="0" w:line="271" w:lineRule="auto"/>
               <w:jc w:val="center"/>
@@ -4726,7 +4644,7 @@
             </w:tcBorders>
             <w:vAlign w:val="center"/>
           </w:tcPr>
-          <w:p ns2:paraId="7A0B06F8" ns2:textId="33BE6B52">
+          <w:p>
             <w:pPr>
               <w:spacing w:after="0" w:line="271" w:lineRule="auto"/>
               <w:jc w:val="center"/>
@@ -4759,7 +4677,7 @@
             </w:tcBorders>
             <w:vAlign w:val="center"/>
           </w:tcPr>
-          <w:p ns2:paraId="2664A22B" ns2:textId="24B88699">
+          <w:p>
             <w:pPr>
               <w:spacing w:after="0" w:line="271" w:lineRule="auto"/>
               <w:jc w:val="center"/>
@@ -4782,7 +4700,7 @@
           </w:p>
         </w:tc>
       </w:tr>
-      <w:tr ns2:paraId="0C5271AA" ns2:textId="7DAE0756">
+      <w:tr>
         <w:trPr>
           <w:trHeight w:val="2498"/>
           <w:jc w:val="center"/>
@@ -4798,7 +4716,7 @@
             </w:tcBorders>
             <w:vAlign w:val="center"/>
           </w:tcPr>
-          <w:p ns2:paraId="165995AE" ns2:textId="1F00B055">
+          <w:p>
             <w:pPr>
               <w:spacing w:after="0" w:line="271" w:lineRule="auto"/>
               <w:jc w:val="center"/>
@@ -4830,7 +4748,7 @@
             </w:tcBorders>
             <w:vAlign w:val="center"/>
           </w:tcPr>
-          <w:p ns2:paraId="05D00284" ns2:textId="787964EC">
+          <w:p>
             <w:pPr>
               <w:spacing w:after="0" w:line="271" w:lineRule="auto"/>
               <w:jc w:val="center"/>
@@ -4846,7 +4764,7 @@
                 <w:sz w:val="26"/>
                 <w:szCs w:val="24"/>
               </w:rPr>
-              <w:t>{{VT_1_TEN}}</w:t>
+              <w:t>Băng ghim dùng trong mổ mở</w:t>
             </w:r>
           </w:p>
         </w:tc>
@@ -4861,7 +4779,7 @@
             </w:tcBorders>
             <w:vAlign w:val="center"/>
           </w:tcPr>
-          <w:p ns2:paraId="6489A333" ns2:textId="1A382593">
+          <w:p>
             <w:pPr>
               <w:spacing w:after="0" w:line="271" w:lineRule="auto"/>
               <w:rPr>
@@ -4876,7 +4794,7 @@
                 <w:sz w:val="26"/>
                 <w:szCs w:val="26"/>
               </w:rPr>
-              <w:t>{{VT_1_TCKT}}</w:t>
+              <w:t>Băng (đạn) ghim khâu máy cắt nối tự động thẳng dùng trong mổ mở công nghệ Tri-staple, cỡ 80mm. Có 3 hàng ghim chiều cao khác nhau mỗi bên, chiều cao ghim trước dập từ trong ra ngoài là: 3.0mm; 3.5mm; 4.0mm, sau khi dập là 1.5 - 2.25mm, ghim bằng Titan. Cung cấp lưỡi dao mới trong mỗi băng đạn. Ghim đóng tạo hình chữ B chuẩn</w:t>
             </w:r>
           </w:p>
         </w:tc>
@@ -4891,7 +4809,7 @@
             </w:tcBorders>
             <w:vAlign w:val="center"/>
           </w:tcPr>
-          <w:p ns2:paraId="0F46D12B" ns2:textId="14D62EF9">
+          <w:p>
             <w:pPr>
               <w:spacing w:after="0" w:line="271" w:lineRule="auto"/>
               <w:jc w:val="center"/>
@@ -4908,7 +4826,7 @@
                 <w:sz w:val="26"/>
                 <w:szCs w:val="24"/>
               </w:rPr>
-              <w:t>{{VT_1_QUY_CACH}}</w:t>
+              <w:t>6 cái/ hộp</w:t>
             </w:r>
           </w:p>
         </w:tc>
@@ -4923,7 +4841,7 @@
             </w:tcBorders>
             <w:vAlign w:val="center"/>
           </w:tcPr>
-          <w:p ns2:paraId="2AD318D8" ns2:textId="0023C146">
+          <w:p>
             <w:pPr>
               <w:spacing w:after="0" w:line="271" w:lineRule="auto"/>
               <w:jc w:val="center"/>
@@ -4954,7 +4872,7 @@
             </w:tcBorders>
             <w:vAlign w:val="center"/>
           </w:tcPr>
-          <w:p ns2:paraId="7F6CCF1C" ns2:textId="4CF90AB1">
+          <w:p>
             <w:pPr>
               <w:spacing w:after="0" w:line="271" w:lineRule="auto"/>
               <w:jc w:val="center"/>
@@ -4985,7 +4903,7 @@
             </w:tcBorders>
             <w:vAlign w:val="center"/>
           </w:tcPr>
-          <w:p ns2:paraId="5ACEF988" ns2:textId="6F38EA43">
+          <w:p>
             <w:pPr>
               <w:spacing w:after="0" w:line="271" w:lineRule="auto"/>
               <w:jc w:val="center"/>
@@ -5002,7 +4920,7 @@
                 <w:sz w:val="26"/>
                 <w:szCs w:val="24"/>
               </w:rPr>
-              <w:t>{{VT_1_DON_GIA}}</w:t>
+              <w:t>2.100.000</w:t>
             </w:r>
           </w:p>
         </w:tc>
@@ -5017,7 +4935,7 @@
             </w:tcBorders>
             <w:vAlign w:val="center"/>
           </w:tcPr>
-          <w:p ns2:paraId="185C6588" ns2:textId="757FFFA7">
+          <w:p>
             <w:pPr>
               <w:spacing w:after="0" w:line="271" w:lineRule="auto"/>
               <w:jc w:val="center"/>
@@ -5033,12 +4951,12 @@
                 <w:sz w:val="26"/>
                 <w:szCs w:val="24"/>
               </w:rPr>
-              <w:t>{{VT_1_THANH_TIEN}}</w:t>
+              <w:t>231.000.000</w:t>
             </w:r>
           </w:p>
         </w:tc>
       </w:tr>
-      <w:tr ns2:paraId="526995A0" ns2:textId="77777777">
+      <w:tr>
         <w:trPr>
           <w:trHeight w:val="1838"/>
           <w:jc w:val="center"/>
@@ -5054,7 +4972,7 @@
             </w:tcBorders>
             <w:vAlign w:val="center"/>
           </w:tcPr>
-          <w:p ns2:paraId="2ABF5FA3" ns2:textId="7AF09EBA">
+          <w:p>
             <w:pPr>
               <w:spacing w:after="0" w:line="271" w:lineRule="auto"/>
               <w:jc w:val="center"/>
@@ -5086,7 +5004,7 @@
             </w:tcBorders>
             <w:vAlign w:val="center"/>
           </w:tcPr>
-          <w:p ns2:paraId="0AC4C03E" ns2:textId="7C06319D">
+          <w:p>
             <w:pPr>
               <w:spacing w:after="0" w:line="271" w:lineRule="auto"/>
               <w:jc w:val="center"/>
@@ -5102,7 +5020,7 @@
                 <w:sz w:val="26"/>
                 <w:szCs w:val="24"/>
               </w:rPr>
-              <w:t>{{VT_2_TEN}}</w:t>
+              <w:t>Dụng cụ khâu nối tròn ba hàng ghim</w:t>
             </w:r>
           </w:p>
         </w:tc>
@@ -5117,7 +5035,7 @@
             </w:tcBorders>
             <w:vAlign w:val="center"/>
           </w:tcPr>
-          <w:p ns2:paraId="390FBDB3" ns2:textId="45D085C0">
+          <w:p>
             <w:pPr>
               <w:spacing w:after="0" w:line="271" w:lineRule="auto"/>
               <w:rPr>
@@ -5132,7 +5050,7 @@
                 <w:sz w:val="26"/>
                 <w:szCs w:val="26"/>
               </w:rPr>
-              <w:t>{{VT_2_TCKT}}</w:t>
+              <w:t>Dụng cụ (máy) cắt khâu nối ống tiêu hóa tròn 3 hàng ghim các cỡ đường kính 28mm, 31mm. Chiều cao ghim trước dập cao dần từ trong ra ngoài là 3.0 mm, 3.5 mm, 4.0 mm. Ghim bằng Titanium. Ghim đóng tạo hình chữ B chuẩn</w:t>
             </w:r>
           </w:p>
         </w:tc>
@@ -5147,7 +5065,7 @@
             </w:tcBorders>
             <w:vAlign w:val="center"/>
           </w:tcPr>
-          <w:p ns2:paraId="2BED5831" ns2:textId="77D4C611">
+          <w:p>
             <w:pPr>
               <w:spacing w:after="0" w:line="271" w:lineRule="auto"/>
               <w:jc w:val="center"/>
@@ -5164,7 +5082,7 @@
                 <w:sz w:val="26"/>
                 <w:szCs w:val="24"/>
               </w:rPr>
-              <w:t>{{VT_2_QUY_CACH}}</w:t>
+              <w:t>3 cái/ hộp</w:t>
             </w:r>
           </w:p>
         </w:tc>
@@ -5179,7 +5097,7 @@
             </w:tcBorders>
             <w:vAlign w:val="center"/>
           </w:tcPr>
-          <w:p ns2:paraId="4B5D1350" ns2:textId="76BA461C">
+          <w:p>
             <w:pPr>
               <w:spacing w:after="0" w:line="271" w:lineRule="auto"/>
               <w:jc w:val="center"/>
@@ -5210,7 +5128,7 @@
             </w:tcBorders>
             <w:vAlign w:val="center"/>
           </w:tcPr>
-          <w:p ns2:paraId="4CBAB0CA" ns2:textId="091C0EE2">
+          <w:p>
             <w:pPr>
               <w:spacing w:after="0" w:line="271" w:lineRule="auto"/>
               <w:jc w:val="center"/>
@@ -5241,7 +5159,7 @@
             </w:tcBorders>
             <w:vAlign w:val="center"/>
           </w:tcPr>
-          <w:p ns2:paraId="311D0F39" ns2:textId="4A7F987D">
+          <w:p>
             <w:pPr>
               <w:spacing w:after="0" w:line="271" w:lineRule="auto"/>
               <w:jc w:val="center"/>
@@ -5258,7 +5176,7 @@
                 <w:sz w:val="26"/>
                 <w:szCs w:val="24"/>
               </w:rPr>
-              <w:t>{{VT_2_DON_GIA}}</w:t>
+              <w:t>14.900.000</w:t>
             </w:r>
           </w:p>
         </w:tc>
@@ -5273,7 +5191,7 @@
             </w:tcBorders>
             <w:vAlign w:val="center"/>
           </w:tcPr>
-          <w:p ns2:paraId="42DDCF61" ns2:textId="1C09BFC4">
+          <w:p>
             <w:pPr>
               <w:spacing w:after="0" w:line="271" w:lineRule="auto"/>
               <w:jc w:val="center"/>
@@ -5289,12 +5207,12 @@
                 <w:sz w:val="26"/>
                 <w:szCs w:val="24"/>
               </w:rPr>
-              <w:t>{{VT_2_THANH_TIEN}}</w:t>
+              <w:t>298.000.000</w:t>
             </w:r>
           </w:p>
         </w:tc>
       </w:tr>
-      <w:tr ns2:paraId="1E1DC162" ns2:textId="77777777">
+      <w:tr>
         <w:trPr>
           <w:trHeight w:val="2718"/>
           <w:jc w:val="center"/>
@@ -5310,7 +5228,7 @@
             </w:tcBorders>
             <w:vAlign w:val="center"/>
           </w:tcPr>
-          <w:p ns2:paraId="6C0142E4" ns2:textId="6506FE90">
+          <w:p>
             <w:pPr>
               <w:spacing w:after="0" w:line="271" w:lineRule="auto"/>
               <w:jc w:val="center"/>
@@ -5343,7 +5261,7 @@
             </w:tcBorders>
             <w:vAlign w:val="center"/>
           </w:tcPr>
-          <w:p ns2:paraId="07700D95" ns2:textId="5860B593">
+          <w:p>
             <w:pPr>
               <w:spacing w:after="0" w:line="271" w:lineRule="auto"/>
               <w:jc w:val="center"/>
@@ -5359,7 +5277,7 @@
                 <w:sz w:val="26"/>
                 <w:szCs w:val="24"/>
               </w:rPr>
-              <w:t>{{VT_3_TEN}}</w:t>
+              <w:t>Dụng cụ khâu cắt nội soi</w:t>
             </w:r>
           </w:p>
         </w:tc>
@@ -5374,7 +5292,7 @@
             </w:tcBorders>
             <w:vAlign w:val="center"/>
           </w:tcPr>
-          <w:p ns2:paraId="70C5BE34" ns2:textId="25F09514">
+          <w:p>
             <w:pPr>
               <w:spacing w:after="0" w:line="271" w:lineRule="auto"/>
               <w:rPr>
@@ -5389,7 +5307,7 @@
                 <w:sz w:val="26"/>
                 <w:szCs w:val="26"/>
               </w:rPr>
-              <w:t>{{VT_3_TCKT}}</w:t>
+              <w:t>Dụng cụ cắt nối tự động dùng trong mổ nội soi tương thích với tất cả băng ghim khâu cắt nội soi. Dụng cụ khi gắn vào băng ghim tương thích có thể bẻ góc 45 độ mỗi bên với 11 điểm gập góc (5 điểm mỗi bên và điểm ở giữa). Nút điều chỉnh gập góc trên thân. Các cỡ độ dài trục nối tương ứng 6cm, 16cm và 26cm.</w:t>
             </w:r>
           </w:p>
         </w:tc>
@@ -5404,7 +5322,7 @@
             </w:tcBorders>
             <w:vAlign w:val="center"/>
           </w:tcPr>
-          <w:p ns2:paraId="6D1ED01E" ns2:textId="38BF828C">
+          <w:p>
             <w:pPr>
               <w:spacing w:after="0" w:line="271" w:lineRule="auto"/>
               <w:jc w:val="center"/>
@@ -5421,7 +5339,7 @@
                 <w:sz w:val="26"/>
                 <w:szCs w:val="24"/>
               </w:rPr>
-              <w:t>{{VT_2_QUY_CACH}}</w:t>
+              <w:t>3 cái/ hộp</w:t>
             </w:r>
           </w:p>
         </w:tc>
@@ -5436,7 +5354,7 @@
             </w:tcBorders>
             <w:vAlign w:val="center"/>
           </w:tcPr>
-          <w:p ns2:paraId="5222F939" ns2:textId="63209C67">
+          <w:p>
             <w:pPr>
               <w:spacing w:after="0" w:line="271" w:lineRule="auto"/>
               <w:jc w:val="center"/>
@@ -5468,7 +5386,7 @@
             </w:tcBorders>
             <w:vAlign w:val="center"/>
           </w:tcPr>
-          <w:p ns2:paraId="22BFCFF5" ns2:textId="14739AC4">
+          <w:p>
             <w:pPr>
               <w:spacing w:after="0" w:line="271" w:lineRule="auto"/>
               <w:jc w:val="center"/>
@@ -5500,7 +5418,7 @@
             </w:tcBorders>
             <w:vAlign w:val="center"/>
           </w:tcPr>
-          <w:p ns2:paraId="3399B216" ns2:textId="3D0E7933">
+          <w:p>
             <w:pPr>
               <w:spacing w:after="0" w:line="271" w:lineRule="auto"/>
               <w:jc w:val="center"/>
@@ -5517,7 +5435,7 @@
                 <w:sz w:val="26"/>
                 <w:szCs w:val="24"/>
               </w:rPr>
-              <w:t>{{VT_3_DON_GIA}}</w:t>
+              <w:t>5.990.000</w:t>
             </w:r>
           </w:p>
         </w:tc>
@@ -5532,7 +5450,7 @@
             </w:tcBorders>
             <w:vAlign w:val="center"/>
           </w:tcPr>
-          <w:p ns2:paraId="2A51C5CB" ns2:textId="6F4C7FCD">
+          <w:p>
             <w:pPr>
               <w:spacing w:after="0" w:line="271" w:lineRule="auto"/>
               <w:jc w:val="center"/>
@@ -5548,12 +5466,12 @@
                 <w:sz w:val="26"/>
                 <w:szCs w:val="24"/>
               </w:rPr>
-              <w:t>{{VT_3_THANH_TIEN}}</w:t>
+              <w:t>29.950.000</w:t>
             </w:r>
           </w:p>
         </w:tc>
       </w:tr>
-      <w:tr ns2:paraId="7365EEF7" ns2:textId="77777777">
+      <w:tr>
         <w:trPr>
           <w:trHeight w:val="2860"/>
           <w:jc w:val="center"/>
@@ -5569,7 +5487,7 @@
             </w:tcBorders>
             <w:vAlign w:val="center"/>
           </w:tcPr>
-          <w:p ns2:paraId="10AF5ADF" ns2:textId="5EF8C559">
+          <w:p>
             <w:pPr>
               <w:spacing w:after="0" w:line="271" w:lineRule="auto"/>
               <w:jc w:val="center"/>
@@ -5603,7 +5521,7 @@
             </w:tcBorders>
             <w:vAlign w:val="center"/>
           </w:tcPr>
-          <w:p ns2:paraId="323DD12A" ns2:textId="08B7BDF4">
+          <w:p>
             <w:pPr>
               <w:spacing w:after="0" w:line="271" w:lineRule="auto"/>
               <w:jc w:val="center"/>
@@ -5619,7 +5537,7 @@
                 <w:sz w:val="26"/>
                 <w:szCs w:val="24"/>
               </w:rPr>
-              <w:t>{{VT_4_TEN}}</w:t>
+              <w:t>Băng ghim cắt khâu nối nội soi các cỡ</w:t>
             </w:r>
           </w:p>
         </w:tc>
@@ -5634,7 +5552,7 @@
             </w:tcBorders>
             <w:vAlign w:val="center"/>
           </w:tcPr>
-          <w:p ns2:paraId="088DFBEC" ns2:textId="5BE63B61">
+          <w:p>
             <w:pPr>
               <w:spacing w:after="0" w:line="271" w:lineRule="auto"/>
               <w:rPr>
@@ -5649,7 +5567,7 @@
                 <w:sz w:val="26"/>
                 <w:szCs w:val="26"/>
               </w:rPr>
-              <w:t>{{VT_4_TCKT}}</w:t>
+              <w:t>Băng (đạn) ghim khâu máy cắt nối tự động nội soi công nghệ Tri-staple. Các cỡ băng ghim dài 30mm, 45mm, 60mm, 3 hàng ghim chiều cao khác nhau mỗi bên, chiều cao ghim trước dập từ trong ra ngoài là: 2.0mm; 2.5mm; 3.0mm hoặc 3.0mm; 3.5mm; 4.0mm, sau khi dập là 0.88 - 1.5mm hoặc 1.5 - 2.25mm, ghim bằng Titan. Cung cấp lưỡi dao mới trong mỗi băng đạn. Có 4 ghim ở đầu xa băng đạn.</w:t>
             </w:r>
           </w:p>
         </w:tc>
@@ -5664,7 +5582,7 @@
             </w:tcBorders>
             <w:vAlign w:val="center"/>
           </w:tcPr>
-          <w:p ns2:paraId="4A064109" ns2:textId="49CE4BE1">
+          <w:p>
             <w:pPr>
               <w:spacing w:after="0" w:line="271" w:lineRule="auto"/>
               <w:jc w:val="center"/>
@@ -5681,7 +5599,7 @@
                 <w:sz w:val="26"/>
                 <w:szCs w:val="24"/>
               </w:rPr>
-              <w:t>{{VT_1_QUY_CACH}}</w:t>
+              <w:t>6 cái/ hộp</w:t>
             </w:r>
           </w:p>
         </w:tc>
@@ -5696,7 +5614,7 @@
             </w:tcBorders>
             <w:vAlign w:val="center"/>
           </w:tcPr>
-          <w:p ns2:paraId="6CF9C7DD" ns2:textId="751D09C9">
+          <w:p>
             <w:pPr>
               <w:spacing w:after="0" w:line="271" w:lineRule="auto"/>
               <w:jc w:val="center"/>
@@ -5728,7 +5646,7 @@
             </w:tcBorders>
             <w:vAlign w:val="center"/>
           </w:tcPr>
-          <w:p ns2:paraId="45756212" ns2:textId="6AD16AAD">
+          <w:p>
             <w:pPr>
               <w:spacing w:after="0" w:line="271" w:lineRule="auto"/>
               <w:jc w:val="center"/>
@@ -5760,7 +5678,7 @@
             </w:tcBorders>
             <w:vAlign w:val="center"/>
           </w:tcPr>
-          <w:p ns2:paraId="43401EE3" ns2:textId="5802E003">
+          <w:p>
             <w:pPr>
               <w:spacing w:after="0" w:line="271" w:lineRule="auto"/>
               <w:jc w:val="center"/>
@@ -5777,7 +5695,7 @@
                 <w:sz w:val="26"/>
                 <w:szCs w:val="24"/>
               </w:rPr>
-              <w:t>{{VT_4_DON_GIA}}</w:t>
+              <w:t>5.500.000</w:t>
             </w:r>
           </w:p>
         </w:tc>
@@ -5792,7 +5710,7 @@
             </w:tcBorders>
             <w:vAlign w:val="center"/>
           </w:tcPr>
-          <w:p ns2:paraId="0DEDB5D9" ns2:textId="0158C0F0">
+          <w:p>
             <w:pPr>
               <w:spacing w:after="0" w:line="271" w:lineRule="auto"/>
               <w:jc w:val="center"/>
@@ -5808,12 +5726,12 @@
                 <w:sz w:val="26"/>
                 <w:szCs w:val="24"/>
               </w:rPr>
-              <w:t>{{VT_4_THANH_TIEN}}</w:t>
+              <w:t>1.441.000.000</w:t>
             </w:r>
           </w:p>
         </w:tc>
       </w:tr>
-      <w:tr ns2:paraId="2F8E938F" ns2:textId="77777777">
+      <w:tr>
         <w:trPr>
           <w:trHeight w:val="836"/>
           <w:jc w:val="center"/>
@@ -5830,7 +5748,7 @@
             </w:tcBorders>
             <w:vAlign w:val="center"/>
           </w:tcPr>
-          <w:p ns2:paraId="0DB51901" ns2:textId="77777777">
+          <w:p>
             <w:pPr>
               <w:spacing w:after="0" w:line="271" w:lineRule="auto"/>
               <w:jc w:val="center"/>
@@ -5853,7 +5771,7 @@
               <w:t>Tổng cộng:</w:t>
             </w:r>
           </w:p>
-          <w:p ns2:paraId="7DDD4760" ns2:textId="79D7DF65">
+          <w:p>
             <w:pPr>
               <w:spacing w:after="0" w:line="271" w:lineRule="auto"/>
               <w:jc w:val="center"/>
@@ -5873,7 +5791,7 @@
                 <w:sz w:val="26"/>
                 <w:szCs w:val="24"/>
               </w:rPr>
-              <w:t>(Bằng chữ: {{TONG_MUC_DU_TOAN_CHU}}./.)</w:t>
+              <w:t>(Bằng chữ: Một tỷ chín trăm chín mươi chín triệu chín trăm năm mươi nghìn đồng./.)</w:t>
             </w:r>
           </w:p>
         </w:tc>
@@ -5888,7 +5806,7 @@
             </w:tcBorders>
             <w:vAlign w:val="center"/>
           </w:tcPr>
-          <w:p ns2:paraId="2D083965" ns2:textId="6D7707B6">
+          <w:p>
             <w:pPr>
               <w:spacing w:after="0" w:line="271" w:lineRule="auto"/>
               <w:jc w:val="center"/>
@@ -5908,14 +5826,14 @@
                 <w:sz w:val="26"/>
                 <w:szCs w:val="24"/>
               </w:rPr>
-              <w:t>{{TONG_MUC_DU_TOAN}}</w:t>
+              <w:t>1.999.950.000</w:t>
             </w:r>
           </w:p>
         </w:tc>
       </w:tr>
     </w:tbl>
     <w:bookmarkEnd w:id="2"/>
-    <w:p ns2:paraId="37654219" ns2:textId="7411DE1F">
+    <w:p>
       <w:pPr>
         <w:tabs>
           <w:tab w:val="left" w:pos="1056"/>
@@ -5947,7 +5865,7 @@
 </w:document>
 </file>
 
-<file path=./word/endnotes.xml><?xml version="1.0" encoding="utf-8"?>
+<file path=word/endnotes.xml><?xml version="1.0" encoding="utf-8"?>
 <w:endnotes xmlns:wpc="http://schemas.microsoft.com/office/word/2010/wordprocessingCanvas" xmlns:cx="http://schemas.microsoft.com/office/drawing/2014/chartex" xmlns:mc="http://schemas.openxmlformats.org/markup-compatibility/2006" xmlns:o="urn:schemas-microsoft-com:office:office" xmlns:r="http://schemas.openxmlformats.org/officeDocument/2006/relationships" xmlns:m="http://schemas.openxmlformats.org/officeDocument/2006/math" xmlns:v="urn:schemas-microsoft-com:vml" xmlns:wp14="http://schemas.microsoft.com/office/word/2010/wordprocessingDrawing" xmlns:wp="http://schemas.openxmlformats.org/drawingml/2006/wordprocessingDrawing" xmlns:w10="urn:schemas-microsoft-com:office:word" xmlns:w="http://schemas.openxmlformats.org/wordprocessingml/2006/main" xmlns:w14="http://schemas.microsoft.com/office/word/2010/wordml" xmlns:w15="http://schemas.microsoft.com/office/word/2012/wordml" xmlns:w16se="http://schemas.microsoft.com/office/word/2015/wordml/symex" xmlns:wpg="http://schemas.microsoft.com/office/word/2010/wordprocessingGroup" xmlns:wpi="http://schemas.microsoft.com/office/word/2010/wordprocessingInk" xmlns:wne="http://schemas.microsoft.com/office/word/2006/wordml" xmlns:wps="http://schemas.microsoft.com/office/word/2010/wordprocessingShape">
   <w:endnote w:type="separator" w:id="-1">
     <w:p>
@@ -5972,60 +5890,7 @@
 </w:endnotes>
 </file>
 
-<file path=./word/fontTable.xml><?xml version="1.0" encoding="utf-8"?>
-<w:fonts xmlns:mc="http://schemas.openxmlformats.org/markup-compatibility/2006" xmlns:r="http://schemas.openxmlformats.org/officeDocument/2006/relationships" xmlns:w="http://schemas.openxmlformats.org/wordprocessingml/2006/main" xmlns:w14="http://schemas.microsoft.com/office/word/2010/wordml" xmlns:w15="http://schemas.microsoft.com/office/word/2012/wordml" xmlns:w16se="http://schemas.microsoft.com/office/word/2015/wordml/symex">
-  <w:font w:name="Times New Roman">
-    <w:panose1 w:val="02020603050405020304"/>
-    <w:family w:val="roman"/>
-    <w:pitch w:val="variable"/>
-    <w:sig w:usb0="E0002EFF" w:usb1="C000785B" w:usb2="00000009" w:usb3="00000000" w:csb0="000001FF" w:csb1="00000000"/>
-  </w:font>
-  <w:font w:name="Calibri">
-    <w:panose1 w:val="020F0502020204030204"/>
-    <w:family w:val="swiss"/>
-    <w:pitch w:val="variable"/>
-    <w:sig w:usb0="E4002EFF" w:usb1="C200247B" w:usb2="00000009" w:usb3="00000000" w:csb0="000001FF" w:csb1="00000000"/>
-  </w:font>
-  <w:font w:name="Courier New">
-    <w:panose1 w:val="02070309020205020404"/>
-    <w:family w:val="modern"/>
-    <w:pitch w:val="fixed"/>
-    <w:sig w:usb0="E0002EFF" w:usb1="C0007843" w:usb2="00000009" w:usb3="00000000" w:csb0="000001FF" w:csb1="00000000"/>
-  </w:font>
-  <w:font w:name="Wingdings">
-    <w:panose1 w:val="05000000000000000000"/>
-    <w:family w:val="auto"/>
-    <w:pitch w:val="variable"/>
-    <w:sig w:usb0="00000000" w:usb1="10000000" w:usb2="00000000" w:usb3="00000000" w:csb0="80000000" w:csb1="00000000"/>
-  </w:font>
-  <w:font w:name="Symbol">
-    <w:panose1 w:val="05050102010706020507"/>
-    <w:family w:val="roman"/>
-    <w:pitch w:val="variable"/>
-    <w:sig w:usb0="00000000" w:usb1="10000000" w:usb2="00000000" w:usb3="00000000" w:csb0="80000000" w:csb1="00000000"/>
-  </w:font>
-  <w:font w:name=".VnTime">
-    <w:altName w:val="Courier New"/>
-    <w:family w:val="swiss"/>
-    <w:pitch w:val="variable"/>
-    <w:sig w:usb0="00000003" w:usb1="00000000" w:usb2="00000000" w:usb3="00000000" w:csb0="00000001" w:csb1="00000000"/>
-  </w:font>
-  <w:font w:name="Segoe UI">
-    <w:panose1 w:val="020B0502040204020203"/>
-    <w:family w:val="swiss"/>
-    <w:pitch w:val="variable"/>
-    <w:sig w:usb0="E4002EFF" w:usb1="C000E47F" w:usb2="00000009" w:usb3="00000000" w:csb0="000001FF" w:csb1="00000000"/>
-  </w:font>
-  <w:font w:name="Cambria">
-    <w:panose1 w:val="02040503050406030204"/>
-    <w:family w:val="roman"/>
-    <w:pitch w:val="variable"/>
-    <w:sig w:usb0="E00006FF" w:usb1="420024FF" w:usb2="02000000" w:usb3="00000000" w:csb0="0000019F" w:csb1="00000000"/>
-  </w:font>
-</w:fonts>
-</file>
-
-<file path=./word/footer1.xml><?xml version="1.0" encoding="utf-8"?>
+<file path=word/footer1.xml><?xml version="1.0" encoding="utf-8"?>
 <w:ftr xmlns:wpc="http://schemas.microsoft.com/office/word/2010/wordprocessingCanvas" xmlns:cx="http://schemas.microsoft.com/office/drawing/2014/chartex" xmlns:mc="http://schemas.openxmlformats.org/markup-compatibility/2006" xmlns:o="urn:schemas-microsoft-com:office:office" xmlns:r="http://schemas.openxmlformats.org/officeDocument/2006/relationships" xmlns:m="http://schemas.openxmlformats.org/officeDocument/2006/math" xmlns:v="urn:schemas-microsoft-com:vml" xmlns:wp14="http://schemas.microsoft.com/office/word/2010/wordprocessingDrawing" xmlns:wp="http://schemas.openxmlformats.org/drawingml/2006/wordprocessingDrawing" xmlns:w10="urn:schemas-microsoft-com:office:word" xmlns:w="http://schemas.openxmlformats.org/wordprocessingml/2006/main" xmlns:w14="http://schemas.microsoft.com/office/word/2010/wordml" xmlns:w15="http://schemas.microsoft.com/office/word/2012/wordml" xmlns:w16se="http://schemas.microsoft.com/office/word/2015/wordml/symex" xmlns:wpg="http://schemas.microsoft.com/office/word/2010/wordprocessingGroup" xmlns:wpi="http://schemas.microsoft.com/office/word/2010/wordprocessingInk" xmlns:wne="http://schemas.microsoft.com/office/word/2006/wordml" xmlns:wps="http://schemas.microsoft.com/office/word/2010/wordprocessingShape">
   <w:p>
     <w:pPr>
@@ -6046,7 +5911,7 @@
 </w:ftr>
 </file>
 
-<file path=./word/footnotes.xml><?xml version="1.0" encoding="utf-8"?>
+<file path=word/footnotes.xml><?xml version="1.0" encoding="utf-8"?>
 <w:footnotes xmlns:wpc="http://schemas.microsoft.com/office/word/2010/wordprocessingCanvas" xmlns:cx="http://schemas.microsoft.com/office/drawing/2014/chartex" xmlns:mc="http://schemas.openxmlformats.org/markup-compatibility/2006" xmlns:o="urn:schemas-microsoft-com:office:office" xmlns:r="http://schemas.openxmlformats.org/officeDocument/2006/relationships" xmlns:m="http://schemas.openxmlformats.org/officeDocument/2006/math" xmlns:v="urn:schemas-microsoft-com:vml" xmlns:wp14="http://schemas.microsoft.com/office/word/2010/wordprocessingDrawing" xmlns:wp="http://schemas.openxmlformats.org/drawingml/2006/wordprocessingDrawing" xmlns:w10="urn:schemas-microsoft-com:office:word" xmlns:w="http://schemas.openxmlformats.org/wordprocessingml/2006/main" xmlns:w14="http://schemas.microsoft.com/office/word/2010/wordml" xmlns:w15="http://schemas.microsoft.com/office/word/2012/wordml" xmlns:w16se="http://schemas.microsoft.com/office/word/2015/wordml/symex" xmlns:wpg="http://schemas.microsoft.com/office/word/2010/wordprocessingGroup" xmlns:wpi="http://schemas.microsoft.com/office/word/2010/wordprocessingInk" xmlns:wne="http://schemas.microsoft.com/office/word/2006/wordml" xmlns:wps="http://schemas.microsoft.com/office/word/2010/wordprocessingShape">
   <w:footnote w:type="separator" w:id="-1">
     <w:p>
@@ -6071,7 +5936,7 @@
 </w:footnotes>
 </file>
 
-<file path=./word/header1.xml><?xml version="1.0" encoding="utf-8"?>
+<file path=word/header1.xml><?xml version="1.0" encoding="utf-8"?>
 <w:hdr xmlns:wpc="http://schemas.microsoft.com/office/word/2010/wordprocessingCanvas" xmlns:cx="http://schemas.microsoft.com/office/drawing/2014/chartex" xmlns:mc="http://schemas.openxmlformats.org/markup-compatibility/2006" xmlns:o="urn:schemas-microsoft-com:office:office" xmlns:r="http://schemas.openxmlformats.org/officeDocument/2006/relationships" xmlns:m="http://schemas.openxmlformats.org/officeDocument/2006/math" xmlns:v="urn:schemas-microsoft-com:vml" xmlns:wp14="http://schemas.microsoft.com/office/word/2010/wordprocessingDrawing" xmlns:wp="http://schemas.openxmlformats.org/drawingml/2006/wordprocessingDrawing" xmlns:w10="urn:schemas-microsoft-com:office:word" xmlns:w="http://schemas.openxmlformats.org/wordprocessingml/2006/main" xmlns:w14="http://schemas.microsoft.com/office/word/2010/wordml" xmlns:w15="http://schemas.microsoft.com/office/word/2012/wordml" xmlns:w16se="http://schemas.microsoft.com/office/word/2015/wordml/symex" xmlns:wpg="http://schemas.microsoft.com/office/word/2010/wordprocessingGroup" xmlns:wpi="http://schemas.microsoft.com/office/word/2010/wordprocessingInk" xmlns:wne="http://schemas.microsoft.com/office/word/2006/wordml" xmlns:wps="http://schemas.microsoft.com/office/word/2010/wordprocessingShape">
   <w:sdt>
     <w:sdtPr>
@@ -6155,7 +6020,7 @@
 </w:hdr>
 </file>
 
-<file path=./word/numbering.xml><?xml version="1.0" encoding="utf-8"?>
+<file path=word/numbering.xml><?xml version="1.0" encoding="utf-8"?>
 <w:numbering xmlns:wpc="http://schemas.microsoft.com/office/word/2010/wordprocessingCanvas" xmlns:cx="http://schemas.microsoft.com/office/drawing/2014/chartex" xmlns:mc="http://schemas.openxmlformats.org/markup-compatibility/2006" xmlns:o="urn:schemas-microsoft-com:office:office" xmlns:r="http://schemas.openxmlformats.org/officeDocument/2006/relationships" xmlns:m="http://schemas.openxmlformats.org/officeDocument/2006/math" xmlns:v="urn:schemas-microsoft-com:vml" xmlns:wp14="http://schemas.microsoft.com/office/word/2010/wordprocessingDrawing" xmlns:wp="http://schemas.openxmlformats.org/drawingml/2006/wordprocessingDrawing" xmlns:w10="urn:schemas-microsoft-com:office:word" xmlns:w="http://schemas.openxmlformats.org/wordprocessingml/2006/main" xmlns:w14="http://schemas.microsoft.com/office/word/2010/wordml" xmlns:w15="http://schemas.microsoft.com/office/word/2012/wordml" xmlns:w16se="http://schemas.microsoft.com/office/word/2015/wordml/symex" xmlns:wpg="http://schemas.microsoft.com/office/word/2010/wordprocessingGroup" xmlns:wpi="http://schemas.microsoft.com/office/word/2010/wordprocessingInk" xmlns:wne="http://schemas.microsoft.com/office/word/2006/wordml" xmlns:wps="http://schemas.microsoft.com/office/word/2010/wordprocessingShape">
   <w:abstractNum w:abstractNumId="0">
     <w:nsid w:val="794808BF"/>
@@ -6276,745 +6141,7 @@
 </w:numbering>
 </file>
 
-<file path=./word/settings.xml><?xml version="1.0" encoding="utf-8"?>
-<w:settings xmlns:mc="http://schemas.openxmlformats.org/markup-compatibility/2006" xmlns:o="urn:schemas-microsoft-com:office:office" xmlns:r="http://schemas.openxmlformats.org/officeDocument/2006/relationships" xmlns:m="http://schemas.openxmlformats.org/officeDocument/2006/math" xmlns:v="urn:schemas-microsoft-com:vml" xmlns:w10="urn:schemas-microsoft-com:office:word" xmlns:w="http://schemas.openxmlformats.org/wordprocessingml/2006/main" xmlns:w14="http://schemas.microsoft.com/office/word/2010/wordml" xmlns:w15="http://schemas.microsoft.com/office/word/2012/wordml" xmlns:w16se="http://schemas.microsoft.com/office/word/2015/wordml/symex" xmlns:sl="http://schemas.openxmlformats.org/schemaLibrary/2006/main">
-  <w:zoom w:percent="100"/>
-  <w:defaultTabStop w:val="720"/>
-  <w:characterSpacingControl w:val="doNotCompress"/>
-  <w:compat>
-    <w:useFELayout/>
-    <w:compatSetting w:name="compatibilityMode" w:uri="http://schemas.microsoft.com/office/word" w:val="14"/>
-    <w:compatSetting w:name="overrideTableStyleFontSizeAndJustification" w:uri="http://schemas.microsoft.com/office/word" w:val="1"/>
-    <w:compatSetting w:name="enableOpenTypeFeatures" w:uri="http://schemas.microsoft.com/office/word" w:val="1"/>
-    <w:compatSetting w:name="doNotFlipMirrorIndents" w:uri="http://schemas.microsoft.com/office/word" w:val="1"/>
-  </w:compat>
-  <w:rsids>
-    <w:rsidRoot w:val="007E7E1B"/>
-    <w:rsid w:val="00001C4F"/>
-    <w:rsid w:val="00002A34"/>
-    <w:rsid w:val="00006C95"/>
-    <w:rsid w:val="00010EA4"/>
-    <w:rsid w:val="00013139"/>
-    <w:rsid w:val="00014BB5"/>
-    <w:rsid w:val="0001733C"/>
-    <w:rsid w:val="000207C4"/>
-    <w:rsid w:val="00024189"/>
-    <w:rsid w:val="00032749"/>
-    <w:rsid w:val="0004018D"/>
-    <w:rsid w:val="00047CB6"/>
-    <w:rsid w:val="00050CE6"/>
-    <w:rsid w:val="0005131B"/>
-    <w:rsid w:val="00056271"/>
-    <w:rsid w:val="00057D99"/>
-    <w:rsid w:val="00063EFA"/>
-    <w:rsid w:val="0007151B"/>
-    <w:rsid w:val="00071DDA"/>
-    <w:rsid w:val="000737B7"/>
-    <w:rsid w:val="00077BA9"/>
-    <w:rsid w:val="00080103"/>
-    <w:rsid w:val="00081423"/>
-    <w:rsid w:val="00087878"/>
-    <w:rsid w:val="00090EEF"/>
-    <w:rsid w:val="00093C93"/>
-    <w:rsid w:val="00097953"/>
-    <w:rsid w:val="000A5CBC"/>
-    <w:rsid w:val="000A6964"/>
-    <w:rsid w:val="000A6B18"/>
-    <w:rsid w:val="000B4F51"/>
-    <w:rsid w:val="000B504B"/>
-    <w:rsid w:val="000B677A"/>
-    <w:rsid w:val="000C01B4"/>
-    <w:rsid w:val="000C4702"/>
-    <w:rsid w:val="000C7BD8"/>
-    <w:rsid w:val="000D06D0"/>
-    <w:rsid w:val="000D20FA"/>
-    <w:rsid w:val="000D659A"/>
-    <w:rsid w:val="000E08F5"/>
-    <w:rsid w:val="000E4821"/>
-    <w:rsid w:val="000E6F58"/>
-    <w:rsid w:val="000F1B92"/>
-    <w:rsid w:val="000F31A8"/>
-    <w:rsid w:val="000F447A"/>
-    <w:rsid w:val="000F4A2C"/>
-    <w:rsid w:val="00106C68"/>
-    <w:rsid w:val="00107BE5"/>
-    <w:rsid w:val="00123D93"/>
-    <w:rsid w:val="00126A52"/>
-    <w:rsid w:val="00134B43"/>
-    <w:rsid w:val="0013659A"/>
-    <w:rsid w:val="00141D00"/>
-    <w:rsid w:val="00141DC4"/>
-    <w:rsid w:val="00143507"/>
-    <w:rsid w:val="00143B7A"/>
-    <w:rsid w:val="00143DB6"/>
-    <w:rsid w:val="00147F88"/>
-    <w:rsid w:val="001501A4"/>
-    <w:rsid w:val="00152576"/>
-    <w:rsid w:val="00156B0C"/>
-    <w:rsid w:val="00160971"/>
-    <w:rsid w:val="00162F45"/>
-    <w:rsid w:val="001631DC"/>
-    <w:rsid w:val="00163418"/>
-    <w:rsid w:val="001645EA"/>
-    <w:rsid w:val="00165405"/>
-    <w:rsid w:val="001702C4"/>
-    <w:rsid w:val="001718F2"/>
-    <w:rsid w:val="00171FBC"/>
-    <w:rsid w:val="0017235B"/>
-    <w:rsid w:val="00177286"/>
-    <w:rsid w:val="0017770B"/>
-    <w:rsid w:val="00183B78"/>
-    <w:rsid w:val="00186F74"/>
-    <w:rsid w:val="00187E5D"/>
-    <w:rsid w:val="0019041A"/>
-    <w:rsid w:val="00191187"/>
-    <w:rsid w:val="001A10D5"/>
-    <w:rsid w:val="001B3E90"/>
-    <w:rsid w:val="001C162F"/>
-    <w:rsid w:val="001D2381"/>
-    <w:rsid w:val="001D78AE"/>
-    <w:rsid w:val="001D7C67"/>
-    <w:rsid w:val="001F55C6"/>
-    <w:rsid w:val="001F68C0"/>
-    <w:rsid w:val="001F77BE"/>
-    <w:rsid w:val="00203B7F"/>
-    <w:rsid w:val="00207846"/>
-    <w:rsid w:val="002176AF"/>
-    <w:rsid w:val="002202BF"/>
-    <w:rsid w:val="00222324"/>
-    <w:rsid w:val="00224113"/>
-    <w:rsid w:val="002242BA"/>
-    <w:rsid w:val="002303B7"/>
-    <w:rsid w:val="002315E9"/>
-    <w:rsid w:val="00237EC2"/>
-    <w:rsid w:val="00241090"/>
-    <w:rsid w:val="00241F5B"/>
-    <w:rsid w:val="00243B42"/>
-    <w:rsid w:val="00245F95"/>
-    <w:rsid w:val="00254F3E"/>
-    <w:rsid w:val="00260841"/>
-    <w:rsid w:val="00261498"/>
-    <w:rsid w:val="00264157"/>
-    <w:rsid w:val="00270C65"/>
-    <w:rsid w:val="00274249"/>
-    <w:rsid w:val="00275F34"/>
-    <w:rsid w:val="00280E2D"/>
-    <w:rsid w:val="002874C1"/>
-    <w:rsid w:val="002879C6"/>
-    <w:rsid w:val="00290E37"/>
-    <w:rsid w:val="0029277E"/>
-    <w:rsid w:val="00293A95"/>
-    <w:rsid w:val="00293D8C"/>
-    <w:rsid w:val="002A22D8"/>
-    <w:rsid w:val="002B21C1"/>
-    <w:rsid w:val="002B398C"/>
-    <w:rsid w:val="002B7B4D"/>
-    <w:rsid w:val="002C55E1"/>
-    <w:rsid w:val="002D64D7"/>
-    <w:rsid w:val="002E178C"/>
-    <w:rsid w:val="002E5D3C"/>
-    <w:rsid w:val="002E7335"/>
-    <w:rsid w:val="002F132C"/>
-    <w:rsid w:val="002F156D"/>
-    <w:rsid w:val="002F2DA1"/>
-    <w:rsid w:val="00303D2F"/>
-    <w:rsid w:val="00305216"/>
-    <w:rsid w:val="00305E47"/>
-    <w:rsid w:val="00311E4A"/>
-    <w:rsid w:val="0032451F"/>
-    <w:rsid w:val="00334DAC"/>
-    <w:rsid w:val="0035556B"/>
-    <w:rsid w:val="00356A22"/>
-    <w:rsid w:val="00357DC2"/>
-    <w:rsid w:val="0036135E"/>
-    <w:rsid w:val="00362D13"/>
-    <w:rsid w:val="0036752A"/>
-    <w:rsid w:val="0037060C"/>
-    <w:rsid w:val="00371C04"/>
-    <w:rsid w:val="00375E42"/>
-    <w:rsid w:val="003809A6"/>
-    <w:rsid w:val="003835A0"/>
-    <w:rsid w:val="0038707B"/>
-    <w:rsid w:val="00391594"/>
-    <w:rsid w:val="003942BB"/>
-    <w:rsid w:val="003A1475"/>
-    <w:rsid w:val="003A2BA2"/>
-    <w:rsid w:val="003A3DEA"/>
-    <w:rsid w:val="003A460D"/>
-    <w:rsid w:val="003B5275"/>
-    <w:rsid w:val="003B7684"/>
-    <w:rsid w:val="003B7BAF"/>
-    <w:rsid w:val="003C7CF8"/>
-    <w:rsid w:val="003D0232"/>
-    <w:rsid w:val="003D3C5C"/>
-    <w:rsid w:val="003D7C8E"/>
-    <w:rsid w:val="003E5F30"/>
-    <w:rsid w:val="003F0D11"/>
-    <w:rsid w:val="003F36E5"/>
-    <w:rsid w:val="003F44E5"/>
-    <w:rsid w:val="003F66B2"/>
-    <w:rsid w:val="00410C77"/>
-    <w:rsid w:val="0041116F"/>
-    <w:rsid w:val="00414467"/>
-    <w:rsid w:val="00420CBA"/>
-    <w:rsid w:val="00422F32"/>
-    <w:rsid w:val="004237CA"/>
-    <w:rsid w:val="0042446B"/>
-    <w:rsid w:val="00426876"/>
-    <w:rsid w:val="00433646"/>
-    <w:rsid w:val="00444E62"/>
-    <w:rsid w:val="004642AF"/>
-    <w:rsid w:val="004711F5"/>
-    <w:rsid w:val="00473FBF"/>
-    <w:rsid w:val="00476966"/>
-    <w:rsid w:val="00480272"/>
-    <w:rsid w:val="00485D37"/>
-    <w:rsid w:val="0049112F"/>
-    <w:rsid w:val="00491D48"/>
-    <w:rsid w:val="004934F7"/>
-    <w:rsid w:val="004941F2"/>
-    <w:rsid w:val="00496A74"/>
-    <w:rsid w:val="004A227D"/>
-    <w:rsid w:val="004A5A71"/>
-    <w:rsid w:val="004B1129"/>
-    <w:rsid w:val="004B4BF2"/>
-    <w:rsid w:val="004C3C9B"/>
-    <w:rsid w:val="004C4469"/>
-    <w:rsid w:val="004C6F8F"/>
-    <w:rsid w:val="004D2716"/>
-    <w:rsid w:val="004D4F5C"/>
-    <w:rsid w:val="004D5CF5"/>
-    <w:rsid w:val="004D7A08"/>
-    <w:rsid w:val="004E2744"/>
-    <w:rsid w:val="004E7A2D"/>
-    <w:rsid w:val="004F1170"/>
-    <w:rsid w:val="00503F74"/>
-    <w:rsid w:val="00505B90"/>
-    <w:rsid w:val="00512D2E"/>
-    <w:rsid w:val="00516344"/>
-    <w:rsid w:val="00520776"/>
-    <w:rsid w:val="00521452"/>
-    <w:rsid w:val="00525CB8"/>
-    <w:rsid w:val="005308FD"/>
-    <w:rsid w:val="00537906"/>
-    <w:rsid w:val="00540832"/>
-    <w:rsid w:val="00542820"/>
-    <w:rsid w:val="005435D7"/>
-    <w:rsid w:val="005476EE"/>
-    <w:rsid w:val="00553FBC"/>
-    <w:rsid w:val="00554186"/>
-    <w:rsid w:val="005611EE"/>
-    <w:rsid w:val="00565FF4"/>
-    <w:rsid w:val="00566AE2"/>
-    <w:rsid w:val="00566CFE"/>
-    <w:rsid w:val="00571139"/>
-    <w:rsid w:val="0057435E"/>
-    <w:rsid w:val="005775DF"/>
-    <w:rsid w:val="00584CB9"/>
-    <w:rsid w:val="005856F9"/>
-    <w:rsid w:val="00585EFF"/>
-    <w:rsid w:val="00591731"/>
-    <w:rsid w:val="005928DB"/>
-    <w:rsid w:val="00593A08"/>
-    <w:rsid w:val="00594500"/>
-    <w:rsid w:val="00595E67"/>
-    <w:rsid w:val="00597C6C"/>
-    <w:rsid w:val="005A278F"/>
-    <w:rsid w:val="005A3E3C"/>
-    <w:rsid w:val="005A40B1"/>
-    <w:rsid w:val="005A4316"/>
-    <w:rsid w:val="005A44E3"/>
-    <w:rsid w:val="005A469F"/>
-    <w:rsid w:val="005A7602"/>
-    <w:rsid w:val="005B1E2E"/>
-    <w:rsid w:val="005B2B0A"/>
-    <w:rsid w:val="005B2B4B"/>
-    <w:rsid w:val="005B3895"/>
-    <w:rsid w:val="005B5274"/>
-    <w:rsid w:val="005B5F6A"/>
-    <w:rsid w:val="005C1107"/>
-    <w:rsid w:val="005D2630"/>
-    <w:rsid w:val="005D684C"/>
-    <w:rsid w:val="005E1B16"/>
-    <w:rsid w:val="005E2F8E"/>
-    <w:rsid w:val="005E44A6"/>
-    <w:rsid w:val="005F01F0"/>
-    <w:rsid w:val="005F059A"/>
-    <w:rsid w:val="005F0BEA"/>
-    <w:rsid w:val="005F6F56"/>
-    <w:rsid w:val="005F7549"/>
-    <w:rsid w:val="00600E3D"/>
-    <w:rsid w:val="00603A53"/>
-    <w:rsid w:val="00605A2C"/>
-    <w:rsid w:val="0060791B"/>
-    <w:rsid w:val="006100BF"/>
-    <w:rsid w:val="00610468"/>
-    <w:rsid w:val="0061284A"/>
-    <w:rsid w:val="006142E4"/>
-    <w:rsid w:val="006230FD"/>
-    <w:rsid w:val="00623F18"/>
-    <w:rsid w:val="00630D9B"/>
-    <w:rsid w:val="00637081"/>
-    <w:rsid w:val="0064024E"/>
-    <w:rsid w:val="00646D04"/>
-    <w:rsid w:val="006517BC"/>
-    <w:rsid w:val="006535F8"/>
-    <w:rsid w:val="00680384"/>
-    <w:rsid w:val="00680C9C"/>
-    <w:rsid w:val="00683381"/>
-    <w:rsid w:val="006868BB"/>
-    <w:rsid w:val="00686BB4"/>
-    <w:rsid w:val="00687BBD"/>
-    <w:rsid w:val="00687D13"/>
-    <w:rsid w:val="00694AF0"/>
-    <w:rsid w:val="00694FB0"/>
-    <w:rsid w:val="00697770"/>
-    <w:rsid w:val="00697A0D"/>
-    <w:rsid w:val="006A27F2"/>
-    <w:rsid w:val="006A3254"/>
-    <w:rsid w:val="006A3A74"/>
-    <w:rsid w:val="006A687E"/>
-    <w:rsid w:val="006B15A2"/>
-    <w:rsid w:val="006B6A81"/>
-    <w:rsid w:val="006C0813"/>
-    <w:rsid w:val="006C0897"/>
-    <w:rsid w:val="006C412C"/>
-    <w:rsid w:val="006C5275"/>
-    <w:rsid w:val="006C53E7"/>
-    <w:rsid w:val="006C64A1"/>
-    <w:rsid w:val="006C7301"/>
-    <w:rsid w:val="006C7CE3"/>
-    <w:rsid w:val="006D2682"/>
-    <w:rsid w:val="006F183B"/>
-    <w:rsid w:val="006F184F"/>
-    <w:rsid w:val="006F6A08"/>
-    <w:rsid w:val="007041B9"/>
-    <w:rsid w:val="0070503F"/>
-    <w:rsid w:val="007115FC"/>
-    <w:rsid w:val="00714612"/>
-    <w:rsid w:val="00715C6F"/>
-    <w:rsid w:val="00717C44"/>
-    <w:rsid w:val="0072125A"/>
-    <w:rsid w:val="00724101"/>
-    <w:rsid w:val="00732694"/>
-    <w:rsid w:val="00734B59"/>
-    <w:rsid w:val="0074018C"/>
-    <w:rsid w:val="00743488"/>
-    <w:rsid w:val="00747CC1"/>
-    <w:rsid w:val="00750321"/>
-    <w:rsid w:val="00755462"/>
-    <w:rsid w:val="00761B7E"/>
-    <w:rsid w:val="00763286"/>
-    <w:rsid w:val="007664F8"/>
-    <w:rsid w:val="00767FDF"/>
-    <w:rsid w:val="00770713"/>
-    <w:rsid w:val="00776BC2"/>
-    <w:rsid w:val="00780685"/>
-    <w:rsid w:val="00782972"/>
-    <w:rsid w:val="007832DF"/>
-    <w:rsid w:val="00786E70"/>
-    <w:rsid w:val="007953A3"/>
-    <w:rsid w:val="00796390"/>
-    <w:rsid w:val="00797E54"/>
-    <w:rsid w:val="007A3A94"/>
-    <w:rsid w:val="007A5141"/>
-    <w:rsid w:val="007B68D8"/>
-    <w:rsid w:val="007B7E20"/>
-    <w:rsid w:val="007C43BA"/>
-    <w:rsid w:val="007D1FF5"/>
-    <w:rsid w:val="007D521E"/>
-    <w:rsid w:val="007E4E0E"/>
-    <w:rsid w:val="007E5EAD"/>
-    <w:rsid w:val="007E7E1B"/>
-    <w:rsid w:val="007F0B94"/>
-    <w:rsid w:val="00800C17"/>
-    <w:rsid w:val="00800F59"/>
-    <w:rsid w:val="00810AB8"/>
-    <w:rsid w:val="00810CDF"/>
-    <w:rsid w:val="008116E0"/>
-    <w:rsid w:val="00811CF2"/>
-    <w:rsid w:val="00812067"/>
-    <w:rsid w:val="00814ADF"/>
-    <w:rsid w:val="008219EB"/>
-    <w:rsid w:val="00821D7C"/>
-    <w:rsid w:val="008323AB"/>
-    <w:rsid w:val="00840424"/>
-    <w:rsid w:val="00841651"/>
-    <w:rsid w:val="00842BB1"/>
-    <w:rsid w:val="00843476"/>
-    <w:rsid w:val="00845A02"/>
-    <w:rsid w:val="00861844"/>
-    <w:rsid w:val="00862F51"/>
-    <w:rsid w:val="008669B9"/>
-    <w:rsid w:val="00873469"/>
-    <w:rsid w:val="008740C7"/>
-    <w:rsid w:val="00880346"/>
-    <w:rsid w:val="00883015"/>
-    <w:rsid w:val="00883385"/>
-    <w:rsid w:val="00883F00"/>
-    <w:rsid w:val="00887824"/>
-    <w:rsid w:val="00887CA4"/>
-    <w:rsid w:val="008927CA"/>
-    <w:rsid w:val="00893609"/>
-    <w:rsid w:val="0089372C"/>
-    <w:rsid w:val="008966AB"/>
-    <w:rsid w:val="00896A53"/>
-    <w:rsid w:val="008A0393"/>
-    <w:rsid w:val="008A3EB6"/>
-    <w:rsid w:val="008B01E6"/>
-    <w:rsid w:val="008B46C9"/>
-    <w:rsid w:val="008B4F49"/>
-    <w:rsid w:val="008B79D7"/>
-    <w:rsid w:val="008C6E8E"/>
-    <w:rsid w:val="008D0AA8"/>
-    <w:rsid w:val="008D34D2"/>
-    <w:rsid w:val="008D3B32"/>
-    <w:rsid w:val="008D505D"/>
-    <w:rsid w:val="008E1854"/>
-    <w:rsid w:val="008E2BFE"/>
-    <w:rsid w:val="008E4754"/>
-    <w:rsid w:val="008F33AF"/>
-    <w:rsid w:val="00902825"/>
-    <w:rsid w:val="0090392B"/>
-    <w:rsid w:val="00907A91"/>
-    <w:rsid w:val="00912D04"/>
-    <w:rsid w:val="009165C7"/>
-    <w:rsid w:val="00924379"/>
-    <w:rsid w:val="00926B92"/>
-    <w:rsid w:val="009307BC"/>
-    <w:rsid w:val="009362A1"/>
-    <w:rsid w:val="00952889"/>
-    <w:rsid w:val="009565CC"/>
-    <w:rsid w:val="00963173"/>
-    <w:rsid w:val="00963E4A"/>
-    <w:rsid w:val="00964C7E"/>
-    <w:rsid w:val="0097017C"/>
-    <w:rsid w:val="0097468E"/>
-    <w:rsid w:val="00976B48"/>
-    <w:rsid w:val="00977F98"/>
-    <w:rsid w:val="009802B4"/>
-    <w:rsid w:val="00983B36"/>
-    <w:rsid w:val="00983FF8"/>
-    <w:rsid w:val="00990989"/>
-    <w:rsid w:val="00990AC3"/>
-    <w:rsid w:val="00995BA1"/>
-    <w:rsid w:val="009A0009"/>
-    <w:rsid w:val="009A2256"/>
-    <w:rsid w:val="009A5957"/>
-    <w:rsid w:val="009B03C3"/>
-    <w:rsid w:val="009B3603"/>
-    <w:rsid w:val="009C0704"/>
-    <w:rsid w:val="009C7236"/>
-    <w:rsid w:val="009D4E95"/>
-    <w:rsid w:val="009E662A"/>
-    <w:rsid w:val="009E665A"/>
-    <w:rsid w:val="009F1E6B"/>
-    <w:rsid w:val="00A0499F"/>
-    <w:rsid w:val="00A12678"/>
-    <w:rsid w:val="00A146A7"/>
-    <w:rsid w:val="00A15238"/>
-    <w:rsid w:val="00A16C16"/>
-    <w:rsid w:val="00A17C6D"/>
-    <w:rsid w:val="00A21C61"/>
-    <w:rsid w:val="00A22664"/>
-    <w:rsid w:val="00A2266D"/>
-    <w:rsid w:val="00A24AA2"/>
-    <w:rsid w:val="00A26823"/>
-    <w:rsid w:val="00A31C5D"/>
-    <w:rsid w:val="00A35451"/>
-    <w:rsid w:val="00A40E94"/>
-    <w:rsid w:val="00A410D4"/>
-    <w:rsid w:val="00A41833"/>
-    <w:rsid w:val="00A503D4"/>
-    <w:rsid w:val="00A52D92"/>
-    <w:rsid w:val="00A60E4A"/>
-    <w:rsid w:val="00A61325"/>
-    <w:rsid w:val="00A61CB3"/>
-    <w:rsid w:val="00A80DA2"/>
-    <w:rsid w:val="00A84052"/>
-    <w:rsid w:val="00A87831"/>
-    <w:rsid w:val="00A9141B"/>
-    <w:rsid w:val="00A92843"/>
-    <w:rsid w:val="00A93BF5"/>
-    <w:rsid w:val="00A96D80"/>
-    <w:rsid w:val="00AA396A"/>
-    <w:rsid w:val="00AA6A64"/>
-    <w:rsid w:val="00AA6E55"/>
-    <w:rsid w:val="00AB1759"/>
-    <w:rsid w:val="00AB5651"/>
-    <w:rsid w:val="00AC6033"/>
-    <w:rsid w:val="00AC7259"/>
-    <w:rsid w:val="00AD2144"/>
-    <w:rsid w:val="00AD22AE"/>
-    <w:rsid w:val="00AD28A9"/>
-    <w:rsid w:val="00AD75A2"/>
-    <w:rsid w:val="00AD7DF1"/>
-    <w:rsid w:val="00AE214A"/>
-    <w:rsid w:val="00AE5BEF"/>
-    <w:rsid w:val="00AE652A"/>
-    <w:rsid w:val="00AE71CE"/>
-    <w:rsid w:val="00AE780E"/>
-    <w:rsid w:val="00AF4718"/>
-    <w:rsid w:val="00B0030C"/>
-    <w:rsid w:val="00B01344"/>
-    <w:rsid w:val="00B10257"/>
-    <w:rsid w:val="00B11A4C"/>
-    <w:rsid w:val="00B12BDF"/>
-    <w:rsid w:val="00B15FDE"/>
-    <w:rsid w:val="00B165DB"/>
-    <w:rsid w:val="00B20A72"/>
-    <w:rsid w:val="00B20E12"/>
-    <w:rsid w:val="00B23CFB"/>
-    <w:rsid w:val="00B26117"/>
-    <w:rsid w:val="00B270DF"/>
-    <w:rsid w:val="00B27298"/>
-    <w:rsid w:val="00B302BA"/>
-    <w:rsid w:val="00B3047F"/>
-    <w:rsid w:val="00B314A9"/>
-    <w:rsid w:val="00B3264D"/>
-    <w:rsid w:val="00B32CEA"/>
-    <w:rsid w:val="00B32E62"/>
-    <w:rsid w:val="00B4397F"/>
-    <w:rsid w:val="00B45BE1"/>
-    <w:rsid w:val="00B47084"/>
-    <w:rsid w:val="00B47089"/>
-    <w:rsid w:val="00B52B73"/>
-    <w:rsid w:val="00B564B6"/>
-    <w:rsid w:val="00B609E0"/>
-    <w:rsid w:val="00B6666F"/>
-    <w:rsid w:val="00B6716C"/>
-    <w:rsid w:val="00B7132B"/>
-    <w:rsid w:val="00B80705"/>
-    <w:rsid w:val="00B81E16"/>
-    <w:rsid w:val="00B856A2"/>
-    <w:rsid w:val="00B871ED"/>
-    <w:rsid w:val="00B936E3"/>
-    <w:rsid w:val="00B955E1"/>
-    <w:rsid w:val="00B95955"/>
-    <w:rsid w:val="00BA5ED7"/>
-    <w:rsid w:val="00BA5F45"/>
-    <w:rsid w:val="00BB0CB2"/>
-    <w:rsid w:val="00BB226E"/>
-    <w:rsid w:val="00BB252C"/>
-    <w:rsid w:val="00BC68C3"/>
-    <w:rsid w:val="00BD08EE"/>
-    <w:rsid w:val="00BD0EF5"/>
-    <w:rsid w:val="00BD20A9"/>
-    <w:rsid w:val="00BE187C"/>
-    <w:rsid w:val="00BE332E"/>
-    <w:rsid w:val="00BE6629"/>
-    <w:rsid w:val="00BF6821"/>
-    <w:rsid w:val="00C00662"/>
-    <w:rsid w:val="00C11243"/>
-    <w:rsid w:val="00C1325C"/>
-    <w:rsid w:val="00C249E9"/>
-    <w:rsid w:val="00C2509C"/>
-    <w:rsid w:val="00C27223"/>
-    <w:rsid w:val="00C278C1"/>
-    <w:rsid w:val="00C3338D"/>
-    <w:rsid w:val="00C34582"/>
-    <w:rsid w:val="00C4151F"/>
-    <w:rsid w:val="00C46E21"/>
-    <w:rsid w:val="00C51B2F"/>
-    <w:rsid w:val="00C55008"/>
-    <w:rsid w:val="00C6328E"/>
-    <w:rsid w:val="00C65A30"/>
-    <w:rsid w:val="00C72AA3"/>
-    <w:rsid w:val="00C77199"/>
-    <w:rsid w:val="00C8390E"/>
-    <w:rsid w:val="00C8486A"/>
-    <w:rsid w:val="00C85323"/>
-    <w:rsid w:val="00C874EC"/>
-    <w:rsid w:val="00C87E1E"/>
-    <w:rsid w:val="00C90BF0"/>
-    <w:rsid w:val="00C95E55"/>
-    <w:rsid w:val="00C96991"/>
-    <w:rsid w:val="00CB0530"/>
-    <w:rsid w:val="00CB300C"/>
-    <w:rsid w:val="00CC1883"/>
-    <w:rsid w:val="00CC20EF"/>
-    <w:rsid w:val="00CC256B"/>
-    <w:rsid w:val="00CC3BAE"/>
-    <w:rsid w:val="00CC4498"/>
-    <w:rsid w:val="00CD2DAC"/>
-    <w:rsid w:val="00CD3204"/>
-    <w:rsid w:val="00CD6237"/>
-    <w:rsid w:val="00CD7196"/>
-    <w:rsid w:val="00CD7EE0"/>
-    <w:rsid w:val="00CE14DE"/>
-    <w:rsid w:val="00CE27A4"/>
-    <w:rsid w:val="00CE5C5D"/>
-    <w:rsid w:val="00CE5D9A"/>
-    <w:rsid w:val="00CE64D0"/>
-    <w:rsid w:val="00CF098B"/>
-    <w:rsid w:val="00CF18BE"/>
-    <w:rsid w:val="00D0741D"/>
-    <w:rsid w:val="00D07BDF"/>
-    <w:rsid w:val="00D158ED"/>
-    <w:rsid w:val="00D2245C"/>
-    <w:rsid w:val="00D224A4"/>
-    <w:rsid w:val="00D23D4C"/>
-    <w:rsid w:val="00D25EB2"/>
-    <w:rsid w:val="00D27B5B"/>
-    <w:rsid w:val="00D30D5C"/>
-    <w:rsid w:val="00D329D2"/>
-    <w:rsid w:val="00D37492"/>
-    <w:rsid w:val="00D428DD"/>
-    <w:rsid w:val="00D43FD3"/>
-    <w:rsid w:val="00D440BF"/>
-    <w:rsid w:val="00D459C8"/>
-    <w:rsid w:val="00D46487"/>
-    <w:rsid w:val="00D46689"/>
-    <w:rsid w:val="00D5319C"/>
-    <w:rsid w:val="00D535B0"/>
-    <w:rsid w:val="00D56F18"/>
-    <w:rsid w:val="00D63CB7"/>
-    <w:rsid w:val="00D64552"/>
-    <w:rsid w:val="00D71D66"/>
-    <w:rsid w:val="00D72614"/>
-    <w:rsid w:val="00D73397"/>
-    <w:rsid w:val="00D734C2"/>
-    <w:rsid w:val="00D74635"/>
-    <w:rsid w:val="00D75516"/>
-    <w:rsid w:val="00D759DF"/>
-    <w:rsid w:val="00D81B37"/>
-    <w:rsid w:val="00D83703"/>
-    <w:rsid w:val="00D921FD"/>
-    <w:rsid w:val="00D92C18"/>
-    <w:rsid w:val="00D97627"/>
-    <w:rsid w:val="00DA04AA"/>
-    <w:rsid w:val="00DA0DCD"/>
-    <w:rsid w:val="00DA1FC5"/>
-    <w:rsid w:val="00DA7190"/>
-    <w:rsid w:val="00DB037B"/>
-    <w:rsid w:val="00DB13F6"/>
-    <w:rsid w:val="00DB5AE7"/>
-    <w:rsid w:val="00DC0CE3"/>
-    <w:rsid w:val="00DC4DA8"/>
-    <w:rsid w:val="00DD07D7"/>
-    <w:rsid w:val="00DD4605"/>
-    <w:rsid w:val="00DD539F"/>
-    <w:rsid w:val="00DD604F"/>
-    <w:rsid w:val="00DD631C"/>
-    <w:rsid w:val="00DE0D5E"/>
-    <w:rsid w:val="00DE7FCA"/>
-    <w:rsid w:val="00E058A8"/>
-    <w:rsid w:val="00E06876"/>
-    <w:rsid w:val="00E07F9C"/>
-    <w:rsid w:val="00E1044B"/>
-    <w:rsid w:val="00E10EBB"/>
-    <w:rsid w:val="00E17C90"/>
-    <w:rsid w:val="00E17CE8"/>
-    <w:rsid w:val="00E3165D"/>
-    <w:rsid w:val="00E31EE2"/>
-    <w:rsid w:val="00E32B03"/>
-    <w:rsid w:val="00E3781E"/>
-    <w:rsid w:val="00E43499"/>
-    <w:rsid w:val="00E53649"/>
-    <w:rsid w:val="00E577A2"/>
-    <w:rsid w:val="00E64E41"/>
-    <w:rsid w:val="00E6547D"/>
-    <w:rsid w:val="00E66A5B"/>
-    <w:rsid w:val="00E71919"/>
-    <w:rsid w:val="00E72262"/>
-    <w:rsid w:val="00E82DEC"/>
-    <w:rsid w:val="00E83B05"/>
-    <w:rsid w:val="00E94757"/>
-    <w:rsid w:val="00E94F99"/>
-    <w:rsid w:val="00E96DC2"/>
-    <w:rsid w:val="00EA3722"/>
-    <w:rsid w:val="00EA380F"/>
-    <w:rsid w:val="00EA4F44"/>
-    <w:rsid w:val="00EA690A"/>
-    <w:rsid w:val="00EA7937"/>
-    <w:rsid w:val="00EB1AF1"/>
-    <w:rsid w:val="00EB33A5"/>
-    <w:rsid w:val="00EB507A"/>
-    <w:rsid w:val="00EC58CA"/>
-    <w:rsid w:val="00EC5976"/>
-    <w:rsid w:val="00ED3871"/>
-    <w:rsid w:val="00ED7351"/>
-    <w:rsid w:val="00EE02D2"/>
-    <w:rsid w:val="00EE0F2A"/>
-    <w:rsid w:val="00EE3771"/>
-    <w:rsid w:val="00EF2399"/>
-    <w:rsid w:val="00EF5045"/>
-    <w:rsid w:val="00F0723B"/>
-    <w:rsid w:val="00F075B7"/>
-    <w:rsid w:val="00F14F5F"/>
-    <w:rsid w:val="00F15060"/>
-    <w:rsid w:val="00F16739"/>
-    <w:rsid w:val="00F173E3"/>
-    <w:rsid w:val="00F30312"/>
-    <w:rsid w:val="00F3251B"/>
-    <w:rsid w:val="00F33DAF"/>
-    <w:rsid w:val="00F34AC6"/>
-    <w:rsid w:val="00F36463"/>
-    <w:rsid w:val="00F37035"/>
-    <w:rsid w:val="00F40332"/>
-    <w:rsid w:val="00F51E75"/>
-    <w:rsid w:val="00F53C9B"/>
-    <w:rsid w:val="00F56131"/>
-    <w:rsid w:val="00F63258"/>
-    <w:rsid w:val="00F6450B"/>
-    <w:rsid w:val="00F65F36"/>
-    <w:rsid w:val="00F67B1F"/>
-    <w:rsid w:val="00F73EC3"/>
-    <w:rsid w:val="00F80676"/>
-    <w:rsid w:val="00F9088C"/>
-    <w:rsid w:val="00F917FD"/>
-    <w:rsid w:val="00F958CD"/>
-    <w:rsid w:val="00F959DA"/>
-    <w:rsid w:val="00FA1AEA"/>
-    <w:rsid w:val="00FA1C8A"/>
-    <w:rsid w:val="00FA3169"/>
-    <w:rsid w:val="00FA3681"/>
-    <w:rsid w:val="00FA3A7A"/>
-    <w:rsid w:val="00FA6A9C"/>
-    <w:rsid w:val="00FA7FBD"/>
-    <w:rsid w:val="00FB4F3B"/>
-    <w:rsid w:val="00FC0888"/>
-    <w:rsid w:val="00FC19B5"/>
-    <w:rsid w:val="00FC1AA7"/>
-    <w:rsid w:val="00FC24C8"/>
-    <w:rsid w:val="00FC75F1"/>
-    <w:rsid w:val="00FE148F"/>
-    <w:rsid w:val="00FE1EAA"/>
-    <w:rsid w:val="00FE2938"/>
-    <w:rsid w:val="00FE38DC"/>
-    <w:rsid w:val="00FE5B67"/>
-    <w:rsid w:val="00FE7EC2"/>
-    <w:rsid w:val="00FF081B"/>
-  </w:rsids>
-  <m:mathPr>
-    <m:mathFont m:val="Cambria Math"/>
-    <m:brkBin m:val="before"/>
-    <m:brkBinSub m:val="--"/>
-    <m:smallFrac/>
-    <m:dispDef/>
-    <m:lMargin m:val="0"/>
-    <m:rMargin m:val="0"/>
-    <m:defJc m:val="centerGroup"/>
-    <m:wrapIndent m:val="1440"/>
-    <m:intLim m:val="subSup"/>
-    <m:naryLim m:val="undOvr"/>
-  </m:mathPr>
-  <w:themeFontLang w:val="en-US"/>
-  <w:clrSchemeMapping w:bg1="light1" w:t1="dark1" w:bg2="light2" w:t2="dark2" w:accent1="accent1" w:accent2="accent2" w:accent3="accent3" w:accent4="accent4" w:accent5="accent5" w:accent6="accent6" w:hyperlink="hyperlink" w:followedHyperlink="followedHyperlink"/>
-  <w:shapeDefaults>
-    <o:shapedefaults v:ext="edit" spidmax="1026"/>
-    <o:shapelayout v:ext="edit">
-      <o:idmap v:ext="edit" data="1"/>
-    </o:shapelayout>
-  </w:shapeDefaults>
-  <w:decimalSymbol w:val="."/>
-  <w:listSeparator w:val=","/>
-  <w14:docId w14:val="01AF4EC2"/>
-  <w15:docId w15:val="{71790DCE-BA3B-4BF1-8D57-A5F441557BE8}"/>
-</w:settings>
-</file>
-
-<file path=./word/styles.xml><?xml version="1.0" encoding="utf-8"?>
+<file path=word/styles.xml><?xml version="1.0" encoding="utf-8"?>
 <w:styles xmlns:mc="http://schemas.openxmlformats.org/markup-compatibility/2006" xmlns:r="http://schemas.openxmlformats.org/officeDocument/2006/relationships" xmlns:w="http://schemas.openxmlformats.org/wordprocessingml/2006/main" xmlns:w14="http://schemas.microsoft.com/office/word/2010/wordml" xmlns:w15="http://schemas.microsoft.com/office/word/2012/wordml" xmlns:w16se="http://schemas.microsoft.com/office/word/2015/wordml/symex">
   <w:docDefaults>
     <w:rPrDefault>
@@ -7586,7 +6713,7 @@
 </w:styles>
 </file>
 
-<file path=./word/theme/theme1.xml><?xml version="1.0" encoding="utf-8"?>
+<file path=word/theme/theme1.xml><?xml version="1.0" encoding="utf-8"?>
 <a:theme xmlns:a="http://schemas.openxmlformats.org/drawingml/2006/main" name="Office Theme">
   <a:themeElements>
     <a:clrScheme name="Office">
@@ -7869,77 +6996,14 @@
 </a:theme>
 </file>
 
-<file path=./word/webSettings.xml><?xml version="1.0" encoding="utf-8"?>
-<w:webSettings xmlns:mc="http://schemas.openxmlformats.org/markup-compatibility/2006" xmlns:r="http://schemas.openxmlformats.org/officeDocument/2006/relationships" xmlns:w="http://schemas.openxmlformats.org/wordprocessingml/2006/main" xmlns:w14="http://schemas.microsoft.com/office/word/2010/wordml" xmlns:w15="http://schemas.microsoft.com/office/word/2012/wordml" xmlns:w16se="http://schemas.microsoft.com/office/word/2015/wordml/symex">
-  <w:divs>
-    <w:div w:id="85923423">
-      <w:bodyDiv w:val="1"/>
-      <w:marLeft w:val="0"/>
-      <w:marRight w:val="0"/>
-      <w:marTop w:val="0"/>
-      <w:marBottom w:val="0"/>
-      <w:divBdr>
-        <w:top w:val="none" w:sz="0" w:space="0" w:color="auto"/>
-        <w:left w:val="none" w:sz="0" w:space="0" w:color="auto"/>
-        <w:bottom w:val="none" w:sz="0" w:space="0" w:color="auto"/>
-        <w:right w:val="none" w:sz="0" w:space="0" w:color="auto"/>
-      </w:divBdr>
-    </w:div>
-    <w:div w:id="523446286">
-      <w:bodyDiv w:val="1"/>
-      <w:marLeft w:val="0"/>
-      <w:marRight w:val="0"/>
-      <w:marTop w:val="0"/>
-      <w:marBottom w:val="0"/>
-      <w:divBdr>
-        <w:top w:val="none" w:sz="0" w:space="0" w:color="auto"/>
-        <w:left w:val="none" w:sz="0" w:space="0" w:color="auto"/>
-        <w:bottom w:val="none" w:sz="0" w:space="0" w:color="auto"/>
-        <w:right w:val="none" w:sz="0" w:space="0" w:color="auto"/>
-      </w:divBdr>
-    </w:div>
-    <w:div w:id="1048841623">
-      <w:bodyDiv w:val="1"/>
-      <w:marLeft w:val="0"/>
-      <w:marRight w:val="0"/>
-      <w:marTop w:val="0"/>
-      <w:marBottom w:val="0"/>
-      <w:divBdr>
-        <w:top w:val="none" w:sz="0" w:space="0" w:color="auto"/>
-        <w:left w:val="none" w:sz="0" w:space="0" w:color="auto"/>
-        <w:bottom w:val="none" w:sz="0" w:space="0" w:color="auto"/>
-        <w:right w:val="none" w:sz="0" w:space="0" w:color="auto"/>
-      </w:divBdr>
-    </w:div>
-    <w:div w:id="1237475230">
-      <w:bodyDiv w:val="1"/>
-      <w:marLeft w:val="0"/>
-      <w:marRight w:val="0"/>
-      <w:marTop w:val="0"/>
-      <w:marBottom w:val="0"/>
-      <w:divBdr>
-        <w:top w:val="none" w:sz="0" w:space="0" w:color="auto"/>
-        <w:left w:val="none" w:sz="0" w:space="0" w:color="auto"/>
-        <w:bottom w:val="none" w:sz="0" w:space="0" w:color="auto"/>
-        <w:right w:val="none" w:sz="0" w:space="0" w:color="auto"/>
-      </w:divBdr>
-    </w:div>
-    <w:div w:id="1311062524">
-      <w:bodyDiv w:val="1"/>
-      <w:marLeft w:val="0"/>
-      <w:marRight w:val="0"/>
-      <w:marTop w:val="0"/>
-      <w:marBottom w:val="0"/>
-      <w:divBdr>
-        <w:top w:val="none" w:sz="0" w:space="0" w:color="auto"/>
-        <w:left w:val="none" w:sz="0" w:space="0" w:color="auto"/>
-        <w:bottom w:val="none" w:sz="0" w:space="0" w:color="auto"/>
-        <w:right w:val="none" w:sz="0" w:space="0" w:color="auto"/>
-      </w:divBdr>
-    </w:div>
-  </w:divs>
-  <w:optimizeForBrowser/>
-  <w:relyOnVML/>
-  <w:allowPNG/>
-</w:webSettings>
+<file path=customXml/item1.xml><?xml version="1.0" encoding="utf-8"?>
+<b:Sources xmlns:b="http://schemas.openxmlformats.org/officeDocument/2006/bibliography" xmlns="http://schemas.openxmlformats.org/officeDocument/2006/bibliography" SelectedStyle="\APASixthEditionOfficeOnline.xsl" StyleName="APA" Version="6"/>
+</file>
+
+<file path=customXml/itemProps1.xml><?xml version="1.0" encoding="utf-8"?>
+<ds:datastoreItem xmlns:ds="http://schemas.openxmlformats.org/officeDocument/2006/customXml" ds:itemID="{09C45EF4-329A-45EF-B587-9D7B79716C8A}">
+  <ds:schemaRefs>
+    <ds:schemaRef ds:uri="http://schemas.openxmlformats.org/officeDocument/2006/bibliography"/>
+  </ds:schemaRefs>
+</ds:datastoreItem>
 </file>
</xml_diff>